<commit_message>
Correct database table count in report
Align the generated Word report with the implemented thirteen-table schema while preserving all validated diagrams and page-count checks.

Co-authored-by: Cursor <cursoragent@cursor.com>
</commit_message>
<xml_diff>
--- a/report/Cafe_Food_Ordering_System_Project_Report.docx
+++ b/report/Cafe_Food_Ordering_System_Project_Report.docx
@@ -138,7 +138,7 @@
       <w:pPr>
         <w:pStyle w:val="Heading1"/>
       </w:pPr>
-      <w:bookmarkStart w:id="0" w:name="_Toc234762070"/>
+      <w:bookmarkStart w:id="0" w:name="_Toc234762544"/>
       <w:r>
         <w:lastRenderedPageBreak/>
         <w:t>Certificate</w:t>
@@ -333,7 +333,7 @@
       <w:pPr>
         <w:pStyle w:val="Heading1"/>
       </w:pPr>
-      <w:bookmarkStart w:id="1" w:name="_Toc234762071"/>
+      <w:bookmarkStart w:id="1" w:name="_Toc234762545"/>
       <w:r>
         <w:lastRenderedPageBreak/>
         <w:t>Student Declaration</w:t>
@@ -393,7 +393,7 @@
       <w:pPr>
         <w:pStyle w:val="Heading1"/>
       </w:pPr>
-      <w:bookmarkStart w:id="2" w:name="_Toc234762072"/>
+      <w:bookmarkStart w:id="2" w:name="_Toc234762546"/>
       <w:r>
         <w:lastRenderedPageBreak/>
         <w:t>Acknowledgement</w:t>
@@ -433,7 +433,7 @@
       <w:pPr>
         <w:pStyle w:val="Heading1"/>
       </w:pPr>
-      <w:bookmarkStart w:id="3" w:name="_Toc234762073"/>
+      <w:bookmarkStart w:id="3" w:name="_Toc234762547"/>
       <w:r>
         <w:lastRenderedPageBreak/>
         <w:t>Abstract</w:t>
@@ -743,7 +743,7 @@
       <w:pPr>
         <w:pStyle w:val="Heading1"/>
       </w:pPr>
-      <w:bookmarkStart w:id="4" w:name="_Toc234762074"/>
+      <w:bookmarkStart w:id="4" w:name="_Toc234762548"/>
       <w:r>
         <w:lastRenderedPageBreak/>
         <w:t>Table of Contents</w:t>
@@ -775,7 +775,7 @@
       <w:r>
         <w:fldChar w:fldCharType="separate"/>
       </w:r>
-      <w:hyperlink w:anchor="_Toc234762070" w:history="1">
+      <w:hyperlink w:anchor="_Toc234762544" w:history="1">
         <w:r>
           <w:rPr>
             <w:rStyle w:val="Hyperlink"/>
@@ -802,7 +802,7 @@
             <w:noProof/>
             <w:webHidden/>
           </w:rPr>
-          <w:instrText xml:space="preserve"> PAGEREF _Toc234762070 \h </w:instrText>
+          <w:instrText xml:space="preserve"> PAGEREF _Toc234762544 \h </w:instrText>
         </w:r>
         <w:r>
           <w:rPr>
@@ -849,7 +849,7 @@
           <w14:ligatures w14:val="standardContextual"/>
         </w:rPr>
       </w:pPr>
-      <w:hyperlink w:anchor="_Toc234762071" w:history="1">
+      <w:hyperlink w:anchor="_Toc234762545" w:history="1">
         <w:r>
           <w:rPr>
             <w:rStyle w:val="Hyperlink"/>
@@ -876,7 +876,7 @@
             <w:noProof/>
             <w:webHidden/>
           </w:rPr>
-          <w:instrText xml:space="preserve"> PAGEREF _Toc234762071 \h </w:instrText>
+          <w:instrText xml:space="preserve"> PAGEREF _Toc234762545 \h </w:instrText>
         </w:r>
         <w:r>
           <w:rPr>
@@ -923,7 +923,7 @@
           <w14:ligatures w14:val="standardContextual"/>
         </w:rPr>
       </w:pPr>
-      <w:hyperlink w:anchor="_Toc234762072" w:history="1">
+      <w:hyperlink w:anchor="_Toc234762546" w:history="1">
         <w:r>
           <w:rPr>
             <w:rStyle w:val="Hyperlink"/>
@@ -950,7 +950,7 @@
             <w:noProof/>
             <w:webHidden/>
           </w:rPr>
-          <w:instrText xml:space="preserve"> PAGEREF _Toc234762072 \h </w:instrText>
+          <w:instrText xml:space="preserve"> PAGEREF _Toc234762546 \h </w:instrText>
         </w:r>
         <w:r>
           <w:rPr>
@@ -997,7 +997,7 @@
           <w14:ligatures w14:val="standardContextual"/>
         </w:rPr>
       </w:pPr>
-      <w:hyperlink w:anchor="_Toc234762073" w:history="1">
+      <w:hyperlink w:anchor="_Toc234762547" w:history="1">
         <w:r>
           <w:rPr>
             <w:rStyle w:val="Hyperlink"/>
@@ -1024,7 +1024,7 @@
             <w:noProof/>
             <w:webHidden/>
           </w:rPr>
-          <w:instrText xml:space="preserve"> PAGEREF _Toc234762073 \h </w:instrText>
+          <w:instrText xml:space="preserve"> PAGEREF _Toc234762547 \h </w:instrText>
         </w:r>
         <w:r>
           <w:rPr>
@@ -1071,7 +1071,7 @@
           <w14:ligatures w14:val="standardContextual"/>
         </w:rPr>
       </w:pPr>
-      <w:hyperlink w:anchor="_Toc234762074" w:history="1">
+      <w:hyperlink w:anchor="_Toc234762548" w:history="1">
         <w:r>
           <w:rPr>
             <w:rStyle w:val="Hyperlink"/>
@@ -1098,7 +1098,7 @@
             <w:noProof/>
             <w:webHidden/>
           </w:rPr>
-          <w:instrText xml:space="preserve"> PAGEREF _Toc234762074 \h </w:instrText>
+          <w:instrText xml:space="preserve"> PAGEREF _Toc234762548 \h </w:instrText>
         </w:r>
         <w:r>
           <w:rPr>
@@ -1145,7 +1145,7 @@
           <w14:ligatures w14:val="standardContextual"/>
         </w:rPr>
       </w:pPr>
-      <w:hyperlink w:anchor="_Toc234762075" w:history="1">
+      <w:hyperlink w:anchor="_Toc234762549" w:history="1">
         <w:r>
           <w:rPr>
             <w:rStyle w:val="Hyperlink"/>
@@ -1172,7 +1172,7 @@
             <w:noProof/>
             <w:webHidden/>
           </w:rPr>
-          <w:instrText xml:space="preserve"> PAGEREF _Toc234762075 \h </w:instrText>
+          <w:instrText xml:space="preserve"> PAGEREF _Toc234762549 \h </w:instrText>
         </w:r>
         <w:r>
           <w:rPr>
@@ -1219,7 +1219,7 @@
           <w14:ligatures w14:val="standardContextual"/>
         </w:rPr>
       </w:pPr>
-      <w:hyperlink w:anchor="_Toc234762076" w:history="1">
+      <w:hyperlink w:anchor="_Toc234762550" w:history="1">
         <w:r>
           <w:rPr>
             <w:rStyle w:val="Hyperlink"/>
@@ -1246,7 +1246,7 @@
             <w:noProof/>
             <w:webHidden/>
           </w:rPr>
-          <w:instrText xml:space="preserve"> PAGEREF _Toc234762076 \h </w:instrText>
+          <w:instrText xml:space="preserve"> PAGEREF _Toc234762550 \h </w:instrText>
         </w:r>
         <w:r>
           <w:rPr>
@@ -1293,7 +1293,7 @@
           <w14:ligatures w14:val="standardContextual"/>
         </w:rPr>
       </w:pPr>
-      <w:hyperlink w:anchor="_Toc234762077" w:history="1">
+      <w:hyperlink w:anchor="_Toc234762551" w:history="1">
         <w:r>
           <w:rPr>
             <w:rStyle w:val="Hyperlink"/>
@@ -1320,7 +1320,7 @@
             <w:noProof/>
             <w:webHidden/>
           </w:rPr>
-          <w:instrText xml:space="preserve"> PAGEREF _Toc234762077 \h </w:instrText>
+          <w:instrText xml:space="preserve"> PAGEREF _Toc234762551 \h </w:instrText>
         </w:r>
         <w:r>
           <w:rPr>
@@ -1367,7 +1367,7 @@
           <w14:ligatures w14:val="standardContextual"/>
         </w:rPr>
       </w:pPr>
-      <w:hyperlink w:anchor="_Toc234762078" w:history="1">
+      <w:hyperlink w:anchor="_Toc234762552" w:history="1">
         <w:r>
           <w:rPr>
             <w:rStyle w:val="Hyperlink"/>
@@ -1394,7 +1394,7 @@
             <w:noProof/>
             <w:webHidden/>
           </w:rPr>
-          <w:instrText xml:space="preserve"> PAGEREF _Toc234762078 \h </w:instrText>
+          <w:instrText xml:space="preserve"> PAGEREF _Toc234762552 \h </w:instrText>
         </w:r>
         <w:r>
           <w:rPr>
@@ -1441,7 +1441,7 @@
           <w14:ligatures w14:val="standardContextual"/>
         </w:rPr>
       </w:pPr>
-      <w:hyperlink w:anchor="_Toc234762079" w:history="1">
+      <w:hyperlink w:anchor="_Toc234762553" w:history="1">
         <w:r>
           <w:rPr>
             <w:rStyle w:val="Hyperlink"/>
@@ -1468,7 +1468,7 @@
             <w:noProof/>
             <w:webHidden/>
           </w:rPr>
-          <w:instrText xml:space="preserve"> PAGEREF _Toc234762079 \h </w:instrText>
+          <w:instrText xml:space="preserve"> PAGEREF _Toc234762553 \h </w:instrText>
         </w:r>
         <w:r>
           <w:rPr>
@@ -1515,7 +1515,7 @@
           <w14:ligatures w14:val="standardContextual"/>
         </w:rPr>
       </w:pPr>
-      <w:hyperlink w:anchor="_Toc234762080" w:history="1">
+      <w:hyperlink w:anchor="_Toc234762554" w:history="1">
         <w:r>
           <w:rPr>
             <w:rStyle w:val="Hyperlink"/>
@@ -1542,7 +1542,7 @@
             <w:noProof/>
             <w:webHidden/>
           </w:rPr>
-          <w:instrText xml:space="preserve"> PAGEREF _Toc234762080 \h </w:instrText>
+          <w:instrText xml:space="preserve"> PAGEREF _Toc234762554 \h </w:instrText>
         </w:r>
         <w:r>
           <w:rPr>
@@ -1589,7 +1589,7 @@
           <w14:ligatures w14:val="standardContextual"/>
         </w:rPr>
       </w:pPr>
-      <w:hyperlink w:anchor="_Toc234762081" w:history="1">
+      <w:hyperlink w:anchor="_Toc234762555" w:history="1">
         <w:r>
           <w:rPr>
             <w:rStyle w:val="Hyperlink"/>
@@ -1616,7 +1616,7 @@
             <w:noProof/>
             <w:webHidden/>
           </w:rPr>
-          <w:instrText xml:space="preserve"> PAGEREF _Toc234762081 \h </w:instrText>
+          <w:instrText xml:space="preserve"> PAGEREF _Toc234762555 \h </w:instrText>
         </w:r>
         <w:r>
           <w:rPr>
@@ -1663,7 +1663,7 @@
           <w14:ligatures w14:val="standardContextual"/>
         </w:rPr>
       </w:pPr>
-      <w:hyperlink w:anchor="_Toc234762082" w:history="1">
+      <w:hyperlink w:anchor="_Toc234762556" w:history="1">
         <w:r>
           <w:rPr>
             <w:rStyle w:val="Hyperlink"/>
@@ -1690,7 +1690,7 @@
             <w:noProof/>
             <w:webHidden/>
           </w:rPr>
-          <w:instrText xml:space="preserve"> PAGEREF _Toc234762082 \h </w:instrText>
+          <w:instrText xml:space="preserve"> PAGEREF _Toc234762556 \h </w:instrText>
         </w:r>
         <w:r>
           <w:rPr>
@@ -1737,7 +1737,7 @@
           <w14:ligatures w14:val="standardContextual"/>
         </w:rPr>
       </w:pPr>
-      <w:hyperlink w:anchor="_Toc234762083" w:history="1">
+      <w:hyperlink w:anchor="_Toc234762557" w:history="1">
         <w:r>
           <w:rPr>
             <w:rStyle w:val="Hyperlink"/>
@@ -1764,7 +1764,7 @@
             <w:noProof/>
             <w:webHidden/>
           </w:rPr>
-          <w:instrText xml:space="preserve"> PAGEREF _Toc234762083 \h </w:instrText>
+          <w:instrText xml:space="preserve"> PAGEREF _Toc234762557 \h </w:instrText>
         </w:r>
         <w:r>
           <w:rPr>
@@ -1811,7 +1811,7 @@
           <w14:ligatures w14:val="standardContextual"/>
         </w:rPr>
       </w:pPr>
-      <w:hyperlink w:anchor="_Toc234762084" w:history="1">
+      <w:hyperlink w:anchor="_Toc234762558" w:history="1">
         <w:r>
           <w:rPr>
             <w:rStyle w:val="Hyperlink"/>
@@ -1838,7 +1838,7 @@
             <w:noProof/>
             <w:webHidden/>
           </w:rPr>
-          <w:instrText xml:space="preserve"> PAGEREF _Toc234762084 \h </w:instrText>
+          <w:instrText xml:space="preserve"> PAGEREF _Toc234762558 \h </w:instrText>
         </w:r>
         <w:r>
           <w:rPr>
@@ -1885,7 +1885,7 @@
           <w14:ligatures w14:val="standardContextual"/>
         </w:rPr>
       </w:pPr>
-      <w:hyperlink w:anchor="_Toc234762085" w:history="1">
+      <w:hyperlink w:anchor="_Toc234762559" w:history="1">
         <w:r>
           <w:rPr>
             <w:rStyle w:val="Hyperlink"/>
@@ -1912,7 +1912,7 @@
             <w:noProof/>
             <w:webHidden/>
           </w:rPr>
-          <w:instrText xml:space="preserve"> PAGEREF _Toc234762085 \h </w:instrText>
+          <w:instrText xml:space="preserve"> PAGEREF _Toc234762559 \h </w:instrText>
         </w:r>
         <w:r>
           <w:rPr>
@@ -1959,7 +1959,7 @@
           <w14:ligatures w14:val="standardContextual"/>
         </w:rPr>
       </w:pPr>
-      <w:hyperlink w:anchor="_Toc234762086" w:history="1">
+      <w:hyperlink w:anchor="_Toc234762560" w:history="1">
         <w:r>
           <w:rPr>
             <w:rStyle w:val="Hyperlink"/>
@@ -1986,7 +1986,7 @@
             <w:noProof/>
             <w:webHidden/>
           </w:rPr>
-          <w:instrText xml:space="preserve"> PAGEREF _Toc234762086 \h </w:instrText>
+          <w:instrText xml:space="preserve"> PAGEREF _Toc234762560 \h </w:instrText>
         </w:r>
         <w:r>
           <w:rPr>
@@ -2033,7 +2033,7 @@
           <w14:ligatures w14:val="standardContextual"/>
         </w:rPr>
       </w:pPr>
-      <w:hyperlink w:anchor="_Toc234762087" w:history="1">
+      <w:hyperlink w:anchor="_Toc234762561" w:history="1">
         <w:r>
           <w:rPr>
             <w:rStyle w:val="Hyperlink"/>
@@ -2060,7 +2060,7 @@
             <w:noProof/>
             <w:webHidden/>
           </w:rPr>
-          <w:instrText xml:space="preserve"> PAGEREF _Toc234762087 \h </w:instrText>
+          <w:instrText xml:space="preserve"> PAGEREF _Toc234762561 \h </w:instrText>
         </w:r>
         <w:r>
           <w:rPr>
@@ -2107,7 +2107,7 @@
           <w14:ligatures w14:val="standardContextual"/>
         </w:rPr>
       </w:pPr>
-      <w:hyperlink w:anchor="_Toc234762088" w:history="1">
+      <w:hyperlink w:anchor="_Toc234762562" w:history="1">
         <w:r>
           <w:rPr>
             <w:rStyle w:val="Hyperlink"/>
@@ -2134,7 +2134,7 @@
             <w:noProof/>
             <w:webHidden/>
           </w:rPr>
-          <w:instrText xml:space="preserve"> PAGEREF _Toc234762088 \h </w:instrText>
+          <w:instrText xml:space="preserve"> PAGEREF _Toc234762562 \h </w:instrText>
         </w:r>
         <w:r>
           <w:rPr>
@@ -2181,7 +2181,7 @@
           <w14:ligatures w14:val="standardContextual"/>
         </w:rPr>
       </w:pPr>
-      <w:hyperlink w:anchor="_Toc234762089" w:history="1">
+      <w:hyperlink w:anchor="_Toc234762563" w:history="1">
         <w:r>
           <w:rPr>
             <w:rStyle w:val="Hyperlink"/>
@@ -2208,7 +2208,7 @@
             <w:noProof/>
             <w:webHidden/>
           </w:rPr>
-          <w:instrText xml:space="preserve"> PAGEREF _Toc234762089 \h </w:instrText>
+          <w:instrText xml:space="preserve"> PAGEREF _Toc234762563 \h </w:instrText>
         </w:r>
         <w:r>
           <w:rPr>
@@ -2255,7 +2255,7 @@
           <w14:ligatures w14:val="standardContextual"/>
         </w:rPr>
       </w:pPr>
-      <w:hyperlink w:anchor="_Toc234762090" w:history="1">
+      <w:hyperlink w:anchor="_Toc234762564" w:history="1">
         <w:r>
           <w:rPr>
             <w:rStyle w:val="Hyperlink"/>
@@ -2282,7 +2282,7 @@
             <w:noProof/>
             <w:webHidden/>
           </w:rPr>
-          <w:instrText xml:space="preserve"> PAGEREF _Toc234762090 \h </w:instrText>
+          <w:instrText xml:space="preserve"> PAGEREF _Toc234762564 \h </w:instrText>
         </w:r>
         <w:r>
           <w:rPr>
@@ -2329,7 +2329,7 @@
           <w14:ligatures w14:val="standardContextual"/>
         </w:rPr>
       </w:pPr>
-      <w:hyperlink w:anchor="_Toc234762091" w:history="1">
+      <w:hyperlink w:anchor="_Toc234762565" w:history="1">
         <w:r>
           <w:rPr>
             <w:rStyle w:val="Hyperlink"/>
@@ -2356,7 +2356,7 @@
             <w:noProof/>
             <w:webHidden/>
           </w:rPr>
-          <w:instrText xml:space="preserve"> PAGEREF _Toc234762091 \h </w:instrText>
+          <w:instrText xml:space="preserve"> PAGEREF _Toc234762565 \h </w:instrText>
         </w:r>
         <w:r>
           <w:rPr>
@@ -2403,7 +2403,7 @@
           <w14:ligatures w14:val="standardContextual"/>
         </w:rPr>
       </w:pPr>
-      <w:hyperlink w:anchor="_Toc234762092" w:history="1">
+      <w:hyperlink w:anchor="_Toc234762566" w:history="1">
         <w:r>
           <w:rPr>
             <w:rStyle w:val="Hyperlink"/>
@@ -2430,7 +2430,7 @@
             <w:noProof/>
             <w:webHidden/>
           </w:rPr>
-          <w:instrText xml:space="preserve"> PAGEREF _Toc234762092 \h </w:instrText>
+          <w:instrText xml:space="preserve"> PAGEREF _Toc234762566 \h </w:instrText>
         </w:r>
         <w:r>
           <w:rPr>
@@ -2477,7 +2477,7 @@
           <w14:ligatures w14:val="standardContextual"/>
         </w:rPr>
       </w:pPr>
-      <w:hyperlink w:anchor="_Toc234762093" w:history="1">
+      <w:hyperlink w:anchor="_Toc234762567" w:history="1">
         <w:r>
           <w:rPr>
             <w:rStyle w:val="Hyperlink"/>
@@ -2504,7 +2504,7 @@
             <w:noProof/>
             <w:webHidden/>
           </w:rPr>
-          <w:instrText xml:space="preserve"> PAGEREF _Toc234762093 \h </w:instrText>
+          <w:instrText xml:space="preserve"> PAGEREF _Toc234762567 \h </w:instrText>
         </w:r>
         <w:r>
           <w:rPr>
@@ -2551,7 +2551,7 @@
           <w14:ligatures w14:val="standardContextual"/>
         </w:rPr>
       </w:pPr>
-      <w:hyperlink w:anchor="_Toc234762094" w:history="1">
+      <w:hyperlink w:anchor="_Toc234762568" w:history="1">
         <w:r>
           <w:rPr>
             <w:rStyle w:val="Hyperlink"/>
@@ -2578,7 +2578,7 @@
             <w:noProof/>
             <w:webHidden/>
           </w:rPr>
-          <w:instrText xml:space="preserve"> PAGEREF _Toc234762094 \h </w:instrText>
+          <w:instrText xml:space="preserve"> PAGEREF _Toc234762568 \h </w:instrText>
         </w:r>
         <w:r>
           <w:rPr>
@@ -2625,7 +2625,7 @@
           <w14:ligatures w14:val="standardContextual"/>
         </w:rPr>
       </w:pPr>
-      <w:hyperlink w:anchor="_Toc234762095" w:history="1">
+      <w:hyperlink w:anchor="_Toc234762569" w:history="1">
         <w:r>
           <w:rPr>
             <w:rStyle w:val="Hyperlink"/>
@@ -2652,7 +2652,7 @@
             <w:noProof/>
             <w:webHidden/>
           </w:rPr>
-          <w:instrText xml:space="preserve"> PAGEREF _Toc234762095 \h </w:instrText>
+          <w:instrText xml:space="preserve"> PAGEREF _Toc234762569 \h </w:instrText>
         </w:r>
         <w:r>
           <w:rPr>
@@ -2699,7 +2699,7 @@
           <w14:ligatures w14:val="standardContextual"/>
         </w:rPr>
       </w:pPr>
-      <w:hyperlink w:anchor="_Toc234762096" w:history="1">
+      <w:hyperlink w:anchor="_Toc234762570" w:history="1">
         <w:r>
           <w:rPr>
             <w:rStyle w:val="Hyperlink"/>
@@ -2726,7 +2726,7 @@
             <w:noProof/>
             <w:webHidden/>
           </w:rPr>
-          <w:instrText xml:space="preserve"> PAGEREF _Toc234762096 \h </w:instrText>
+          <w:instrText xml:space="preserve"> PAGEREF _Toc234762570 \h </w:instrText>
         </w:r>
         <w:r>
           <w:rPr>
@@ -2773,7 +2773,7 @@
           <w14:ligatures w14:val="standardContextual"/>
         </w:rPr>
       </w:pPr>
-      <w:hyperlink w:anchor="_Toc234762097" w:history="1">
+      <w:hyperlink w:anchor="_Toc234762571" w:history="1">
         <w:r>
           <w:rPr>
             <w:rStyle w:val="Hyperlink"/>
@@ -2800,7 +2800,7 @@
             <w:noProof/>
             <w:webHidden/>
           </w:rPr>
-          <w:instrText xml:space="preserve"> PAGEREF _Toc234762097 \h </w:instrText>
+          <w:instrText xml:space="preserve"> PAGEREF _Toc234762571 \h </w:instrText>
         </w:r>
         <w:r>
           <w:rPr>
@@ -2847,7 +2847,7 @@
           <w14:ligatures w14:val="standardContextual"/>
         </w:rPr>
       </w:pPr>
-      <w:hyperlink w:anchor="_Toc234762098" w:history="1">
+      <w:hyperlink w:anchor="_Toc234762572" w:history="1">
         <w:r>
           <w:rPr>
             <w:rStyle w:val="Hyperlink"/>
@@ -2874,7 +2874,7 @@
             <w:noProof/>
             <w:webHidden/>
           </w:rPr>
-          <w:instrText xml:space="preserve"> PAGEREF _Toc234762098 \h </w:instrText>
+          <w:instrText xml:space="preserve"> PAGEREF _Toc234762572 \h </w:instrText>
         </w:r>
         <w:r>
           <w:rPr>
@@ -2921,7 +2921,7 @@
           <w14:ligatures w14:val="standardContextual"/>
         </w:rPr>
       </w:pPr>
-      <w:hyperlink w:anchor="_Toc234762099" w:history="1">
+      <w:hyperlink w:anchor="_Toc234762573" w:history="1">
         <w:r>
           <w:rPr>
             <w:rStyle w:val="Hyperlink"/>
@@ -2948,7 +2948,7 @@
             <w:noProof/>
             <w:webHidden/>
           </w:rPr>
-          <w:instrText xml:space="preserve"> PAGEREF _Toc234762099 \h </w:instrText>
+          <w:instrText xml:space="preserve"> PAGEREF _Toc234762573 \h </w:instrText>
         </w:r>
         <w:r>
           <w:rPr>
@@ -2995,7 +2995,7 @@
           <w14:ligatures w14:val="standardContextual"/>
         </w:rPr>
       </w:pPr>
-      <w:hyperlink w:anchor="_Toc234762100" w:history="1">
+      <w:hyperlink w:anchor="_Toc234762574" w:history="1">
         <w:r>
           <w:rPr>
             <w:rStyle w:val="Hyperlink"/>
@@ -3022,7 +3022,7 @@
             <w:noProof/>
             <w:webHidden/>
           </w:rPr>
-          <w:instrText xml:space="preserve"> PAGEREF _Toc234762100 \h </w:instrText>
+          <w:instrText xml:space="preserve"> PAGEREF _Toc234762574 \h </w:instrText>
         </w:r>
         <w:r>
           <w:rPr>
@@ -3069,7 +3069,7 @@
           <w14:ligatures w14:val="standardContextual"/>
         </w:rPr>
       </w:pPr>
-      <w:hyperlink w:anchor="_Toc234762101" w:history="1">
+      <w:hyperlink w:anchor="_Toc234762575" w:history="1">
         <w:r>
           <w:rPr>
             <w:rStyle w:val="Hyperlink"/>
@@ -3096,7 +3096,7 @@
             <w:noProof/>
             <w:webHidden/>
           </w:rPr>
-          <w:instrText xml:space="preserve"> PAGEREF _Toc234762101 \h </w:instrText>
+          <w:instrText xml:space="preserve"> PAGEREF _Toc234762575 \h </w:instrText>
         </w:r>
         <w:r>
           <w:rPr>
@@ -3143,7 +3143,7 @@
           <w14:ligatures w14:val="standardContextual"/>
         </w:rPr>
       </w:pPr>
-      <w:hyperlink w:anchor="_Toc234762102" w:history="1">
+      <w:hyperlink w:anchor="_Toc234762576" w:history="1">
         <w:r>
           <w:rPr>
             <w:rStyle w:val="Hyperlink"/>
@@ -3170,7 +3170,7 @@
             <w:noProof/>
             <w:webHidden/>
           </w:rPr>
-          <w:instrText xml:space="preserve"> PAGEREF _Toc234762102 \h </w:instrText>
+          <w:instrText xml:space="preserve"> PAGEREF _Toc234762576 \h </w:instrText>
         </w:r>
         <w:r>
           <w:rPr>
@@ -3217,7 +3217,7 @@
           <w14:ligatures w14:val="standardContextual"/>
         </w:rPr>
       </w:pPr>
-      <w:hyperlink w:anchor="_Toc234762103" w:history="1">
+      <w:hyperlink w:anchor="_Toc234762577" w:history="1">
         <w:r>
           <w:rPr>
             <w:rStyle w:val="Hyperlink"/>
@@ -3244,7 +3244,7 @@
             <w:noProof/>
             <w:webHidden/>
           </w:rPr>
-          <w:instrText xml:space="preserve"> PAGEREF _Toc234762103 \h </w:instrText>
+          <w:instrText xml:space="preserve"> PAGEREF _Toc234762577 \h </w:instrText>
         </w:r>
         <w:r>
           <w:rPr>
@@ -3291,7 +3291,7 @@
           <w14:ligatures w14:val="standardContextual"/>
         </w:rPr>
       </w:pPr>
-      <w:hyperlink w:anchor="_Toc234762104" w:history="1">
+      <w:hyperlink w:anchor="_Toc234762578" w:history="1">
         <w:r>
           <w:rPr>
             <w:rStyle w:val="Hyperlink"/>
@@ -3318,7 +3318,7 @@
             <w:noProof/>
             <w:webHidden/>
           </w:rPr>
-          <w:instrText xml:space="preserve"> PAGEREF _Toc234762104 \h </w:instrText>
+          <w:instrText xml:space="preserve"> PAGEREF _Toc234762578 \h </w:instrText>
         </w:r>
         <w:r>
           <w:rPr>
@@ -3365,7 +3365,7 @@
           <w14:ligatures w14:val="standardContextual"/>
         </w:rPr>
       </w:pPr>
-      <w:hyperlink w:anchor="_Toc234762105" w:history="1">
+      <w:hyperlink w:anchor="_Toc234762579" w:history="1">
         <w:r>
           <w:rPr>
             <w:rStyle w:val="Hyperlink"/>
@@ -3392,7 +3392,7 @@
             <w:noProof/>
             <w:webHidden/>
           </w:rPr>
-          <w:instrText xml:space="preserve"> PAGEREF _Toc234762105 \h </w:instrText>
+          <w:instrText xml:space="preserve"> PAGEREF _Toc234762579 \h </w:instrText>
         </w:r>
         <w:r>
           <w:rPr>
@@ -3439,7 +3439,7 @@
           <w14:ligatures w14:val="standardContextual"/>
         </w:rPr>
       </w:pPr>
-      <w:hyperlink w:anchor="_Toc234762106" w:history="1">
+      <w:hyperlink w:anchor="_Toc234762580" w:history="1">
         <w:r>
           <w:rPr>
             <w:rStyle w:val="Hyperlink"/>
@@ -3466,7 +3466,7 @@
             <w:noProof/>
             <w:webHidden/>
           </w:rPr>
-          <w:instrText xml:space="preserve"> PAGEREF _Toc234762106 \h </w:instrText>
+          <w:instrText xml:space="preserve"> PAGEREF _Toc234762580 \h </w:instrText>
         </w:r>
         <w:r>
           <w:rPr>
@@ -3513,7 +3513,7 @@
           <w14:ligatures w14:val="standardContextual"/>
         </w:rPr>
       </w:pPr>
-      <w:hyperlink w:anchor="_Toc234762107" w:history="1">
+      <w:hyperlink w:anchor="_Toc234762581" w:history="1">
         <w:r>
           <w:rPr>
             <w:rStyle w:val="Hyperlink"/>
@@ -3540,7 +3540,7 @@
             <w:noProof/>
             <w:webHidden/>
           </w:rPr>
-          <w:instrText xml:space="preserve"> PAGEREF _Toc234762107 \h </w:instrText>
+          <w:instrText xml:space="preserve"> PAGEREF _Toc234762581 \h </w:instrText>
         </w:r>
         <w:r>
           <w:rPr>
@@ -3587,7 +3587,7 @@
           <w14:ligatures w14:val="standardContextual"/>
         </w:rPr>
       </w:pPr>
-      <w:hyperlink w:anchor="_Toc234762108" w:history="1">
+      <w:hyperlink w:anchor="_Toc234762582" w:history="1">
         <w:r>
           <w:rPr>
             <w:rStyle w:val="Hyperlink"/>
@@ -3614,7 +3614,7 @@
             <w:noProof/>
             <w:webHidden/>
           </w:rPr>
-          <w:instrText xml:space="preserve"> PAGEREF _Toc234762108 \h </w:instrText>
+          <w:instrText xml:space="preserve"> PAGEREF _Toc234762582 \h </w:instrText>
         </w:r>
         <w:r>
           <w:rPr>
@@ -3661,7 +3661,7 @@
           <w14:ligatures w14:val="standardContextual"/>
         </w:rPr>
       </w:pPr>
-      <w:hyperlink w:anchor="_Toc234762109" w:history="1">
+      <w:hyperlink w:anchor="_Toc234762583" w:history="1">
         <w:r>
           <w:rPr>
             <w:rStyle w:val="Hyperlink"/>
@@ -3688,7 +3688,7 @@
             <w:noProof/>
             <w:webHidden/>
           </w:rPr>
-          <w:instrText xml:space="preserve"> PAGEREF _Toc234762109 \h </w:instrText>
+          <w:instrText xml:space="preserve"> PAGEREF _Toc234762583 \h </w:instrText>
         </w:r>
         <w:r>
           <w:rPr>
@@ -3735,7 +3735,7 @@
           <w14:ligatures w14:val="standardContextual"/>
         </w:rPr>
       </w:pPr>
-      <w:hyperlink w:anchor="_Toc234762110" w:history="1">
+      <w:hyperlink w:anchor="_Toc234762584" w:history="1">
         <w:r>
           <w:rPr>
             <w:rStyle w:val="Hyperlink"/>
@@ -3762,7 +3762,7 @@
             <w:noProof/>
             <w:webHidden/>
           </w:rPr>
-          <w:instrText xml:space="preserve"> PAGEREF _Toc234762110 \h </w:instrText>
+          <w:instrText xml:space="preserve"> PAGEREF _Toc234762584 \h </w:instrText>
         </w:r>
         <w:r>
           <w:rPr>
@@ -3809,7 +3809,7 @@
           <w14:ligatures w14:val="standardContextual"/>
         </w:rPr>
       </w:pPr>
-      <w:hyperlink w:anchor="_Toc234762111" w:history="1">
+      <w:hyperlink w:anchor="_Toc234762585" w:history="1">
         <w:r>
           <w:rPr>
             <w:rStyle w:val="Hyperlink"/>
@@ -3836,7 +3836,7 @@
             <w:noProof/>
             <w:webHidden/>
           </w:rPr>
-          <w:instrText xml:space="preserve"> PAGEREF _Toc234762111 \h </w:instrText>
+          <w:instrText xml:space="preserve"> PAGEREF _Toc234762585 \h </w:instrText>
         </w:r>
         <w:r>
           <w:rPr>
@@ -3883,7 +3883,7 @@
           <w14:ligatures w14:val="standardContextual"/>
         </w:rPr>
       </w:pPr>
-      <w:hyperlink w:anchor="_Toc234762112" w:history="1">
+      <w:hyperlink w:anchor="_Toc234762586" w:history="1">
         <w:r>
           <w:rPr>
             <w:rStyle w:val="Hyperlink"/>
@@ -3910,7 +3910,7 @@
             <w:noProof/>
             <w:webHidden/>
           </w:rPr>
-          <w:instrText xml:space="preserve"> PAGEREF _Toc234762112 \h </w:instrText>
+          <w:instrText xml:space="preserve"> PAGEREF _Toc234762586 \h </w:instrText>
         </w:r>
         <w:r>
           <w:rPr>
@@ -3957,7 +3957,7 @@
           <w14:ligatures w14:val="standardContextual"/>
         </w:rPr>
       </w:pPr>
-      <w:hyperlink w:anchor="_Toc234762113" w:history="1">
+      <w:hyperlink w:anchor="_Toc234762587" w:history="1">
         <w:r>
           <w:rPr>
             <w:rStyle w:val="Hyperlink"/>
@@ -3984,7 +3984,7 @@
             <w:noProof/>
             <w:webHidden/>
           </w:rPr>
-          <w:instrText xml:space="preserve"> PAGEREF _Toc234762113 \h </w:instrText>
+          <w:instrText xml:space="preserve"> PAGEREF _Toc234762587 \h </w:instrText>
         </w:r>
         <w:r>
           <w:rPr>
@@ -4031,7 +4031,7 @@
           <w14:ligatures w14:val="standardContextual"/>
         </w:rPr>
       </w:pPr>
-      <w:hyperlink w:anchor="_Toc234762114" w:history="1">
+      <w:hyperlink w:anchor="_Toc234762588" w:history="1">
         <w:r>
           <w:rPr>
             <w:rStyle w:val="Hyperlink"/>
@@ -4058,7 +4058,7 @@
             <w:noProof/>
             <w:webHidden/>
           </w:rPr>
-          <w:instrText xml:space="preserve"> PAGEREF _Toc234762114 \h </w:instrText>
+          <w:instrText xml:space="preserve"> PAGEREF _Toc234762588 \h </w:instrText>
         </w:r>
         <w:r>
           <w:rPr>
@@ -4105,7 +4105,7 @@
           <w14:ligatures w14:val="standardContextual"/>
         </w:rPr>
       </w:pPr>
-      <w:hyperlink w:anchor="_Toc234762115" w:history="1">
+      <w:hyperlink w:anchor="_Toc234762589" w:history="1">
         <w:r>
           <w:rPr>
             <w:rStyle w:val="Hyperlink"/>
@@ -4132,7 +4132,7 @@
             <w:noProof/>
             <w:webHidden/>
           </w:rPr>
-          <w:instrText xml:space="preserve"> PAGEREF _Toc234762115 \h </w:instrText>
+          <w:instrText xml:space="preserve"> PAGEREF _Toc234762589 \h </w:instrText>
         </w:r>
         <w:r>
           <w:rPr>
@@ -4179,7 +4179,7 @@
           <w14:ligatures w14:val="standardContextual"/>
         </w:rPr>
       </w:pPr>
-      <w:hyperlink w:anchor="_Toc234762116" w:history="1">
+      <w:hyperlink w:anchor="_Toc234762590" w:history="1">
         <w:r>
           <w:rPr>
             <w:rStyle w:val="Hyperlink"/>
@@ -4206,7 +4206,7 @@
             <w:noProof/>
             <w:webHidden/>
           </w:rPr>
-          <w:instrText xml:space="preserve"> PAGEREF _Toc234762116 \h </w:instrText>
+          <w:instrText xml:space="preserve"> PAGEREF _Toc234762590 \h </w:instrText>
         </w:r>
         <w:r>
           <w:rPr>
@@ -4253,7 +4253,7 @@
           <w14:ligatures w14:val="standardContextual"/>
         </w:rPr>
       </w:pPr>
-      <w:hyperlink w:anchor="_Toc234762117" w:history="1">
+      <w:hyperlink w:anchor="_Toc234762591" w:history="1">
         <w:r>
           <w:rPr>
             <w:rStyle w:val="Hyperlink"/>
@@ -4280,7 +4280,7 @@
             <w:noProof/>
             <w:webHidden/>
           </w:rPr>
-          <w:instrText xml:space="preserve"> PAGEREF _Toc234762117 \h </w:instrText>
+          <w:instrText xml:space="preserve"> PAGEREF _Toc234762591 \h </w:instrText>
         </w:r>
         <w:r>
           <w:rPr>
@@ -4327,7 +4327,7 @@
           <w14:ligatures w14:val="standardContextual"/>
         </w:rPr>
       </w:pPr>
-      <w:hyperlink w:anchor="_Toc234762118" w:history="1">
+      <w:hyperlink w:anchor="_Toc234762592" w:history="1">
         <w:r>
           <w:rPr>
             <w:rStyle w:val="Hyperlink"/>
@@ -4354,7 +4354,7 @@
             <w:noProof/>
             <w:webHidden/>
           </w:rPr>
-          <w:instrText xml:space="preserve"> PAGEREF _Toc234762118 \h </w:instrText>
+          <w:instrText xml:space="preserve"> PAGEREF _Toc234762592 \h </w:instrText>
         </w:r>
         <w:r>
           <w:rPr>
@@ -4401,7 +4401,7 @@
           <w14:ligatures w14:val="standardContextual"/>
         </w:rPr>
       </w:pPr>
-      <w:hyperlink w:anchor="_Toc234762119" w:history="1">
+      <w:hyperlink w:anchor="_Toc234762593" w:history="1">
         <w:r>
           <w:rPr>
             <w:rStyle w:val="Hyperlink"/>
@@ -4428,7 +4428,7 @@
             <w:noProof/>
             <w:webHidden/>
           </w:rPr>
-          <w:instrText xml:space="preserve"> PAGEREF _Toc234762119 \h </w:instrText>
+          <w:instrText xml:space="preserve"> PAGEREF _Toc234762593 \h </w:instrText>
         </w:r>
         <w:r>
           <w:rPr>
@@ -4475,7 +4475,7 @@
           <w14:ligatures w14:val="standardContextual"/>
         </w:rPr>
       </w:pPr>
-      <w:hyperlink w:anchor="_Toc234762120" w:history="1">
+      <w:hyperlink w:anchor="_Toc234762594" w:history="1">
         <w:r>
           <w:rPr>
             <w:rStyle w:val="Hyperlink"/>
@@ -4502,7 +4502,7 @@
             <w:noProof/>
             <w:webHidden/>
           </w:rPr>
-          <w:instrText xml:space="preserve"> PAGEREF _Toc234762120 \h </w:instrText>
+          <w:instrText xml:space="preserve"> PAGEREF _Toc234762594 \h </w:instrText>
         </w:r>
         <w:r>
           <w:rPr>
@@ -4549,7 +4549,7 @@
           <w14:ligatures w14:val="standardContextual"/>
         </w:rPr>
       </w:pPr>
-      <w:hyperlink w:anchor="_Toc234762121" w:history="1">
+      <w:hyperlink w:anchor="_Toc234762595" w:history="1">
         <w:r>
           <w:rPr>
             <w:rStyle w:val="Hyperlink"/>
@@ -4576,7 +4576,7 @@
             <w:noProof/>
             <w:webHidden/>
           </w:rPr>
-          <w:instrText xml:space="preserve"> PAGEREF _Toc234762121 \h </w:instrText>
+          <w:instrText xml:space="preserve"> PAGEREF _Toc234762595 \h </w:instrText>
         </w:r>
         <w:r>
           <w:rPr>
@@ -4623,7 +4623,7 @@
           <w14:ligatures w14:val="standardContextual"/>
         </w:rPr>
       </w:pPr>
-      <w:hyperlink w:anchor="_Toc234762122" w:history="1">
+      <w:hyperlink w:anchor="_Toc234762596" w:history="1">
         <w:r>
           <w:rPr>
             <w:rStyle w:val="Hyperlink"/>
@@ -4650,7 +4650,7 @@
             <w:noProof/>
             <w:webHidden/>
           </w:rPr>
-          <w:instrText xml:space="preserve"> PAGEREF _Toc234762122 \h </w:instrText>
+          <w:instrText xml:space="preserve"> PAGEREF _Toc234762596 \h </w:instrText>
         </w:r>
         <w:r>
           <w:rPr>
@@ -4697,7 +4697,7 @@
           <w14:ligatures w14:val="standardContextual"/>
         </w:rPr>
       </w:pPr>
-      <w:hyperlink w:anchor="_Toc234762123" w:history="1">
+      <w:hyperlink w:anchor="_Toc234762597" w:history="1">
         <w:r>
           <w:rPr>
             <w:rStyle w:val="Hyperlink"/>
@@ -4724,7 +4724,7 @@
             <w:noProof/>
             <w:webHidden/>
           </w:rPr>
-          <w:instrText xml:space="preserve"> PAGEREF _Toc234762123 \h </w:instrText>
+          <w:instrText xml:space="preserve"> PAGEREF _Toc234762597 \h </w:instrText>
         </w:r>
         <w:r>
           <w:rPr>
@@ -4771,7 +4771,7 @@
           <w14:ligatures w14:val="standardContextual"/>
         </w:rPr>
       </w:pPr>
-      <w:hyperlink w:anchor="_Toc234762124" w:history="1">
+      <w:hyperlink w:anchor="_Toc234762598" w:history="1">
         <w:r>
           <w:rPr>
             <w:rStyle w:val="Hyperlink"/>
@@ -4798,7 +4798,7 @@
             <w:noProof/>
             <w:webHidden/>
           </w:rPr>
-          <w:instrText xml:space="preserve"> PAGEREF _Toc234762124 \h </w:instrText>
+          <w:instrText xml:space="preserve"> PAGEREF _Toc234762598 \h </w:instrText>
         </w:r>
         <w:r>
           <w:rPr>
@@ -4845,7 +4845,7 @@
           <w14:ligatures w14:val="standardContextual"/>
         </w:rPr>
       </w:pPr>
-      <w:hyperlink w:anchor="_Toc234762125" w:history="1">
+      <w:hyperlink w:anchor="_Toc234762599" w:history="1">
         <w:r>
           <w:rPr>
             <w:rStyle w:val="Hyperlink"/>
@@ -4872,7 +4872,7 @@
             <w:noProof/>
             <w:webHidden/>
           </w:rPr>
-          <w:instrText xml:space="preserve"> PAGEREF _Toc234762125 \h </w:instrText>
+          <w:instrText xml:space="preserve"> PAGEREF _Toc234762599 \h </w:instrText>
         </w:r>
         <w:r>
           <w:rPr>
@@ -4919,7 +4919,7 @@
           <w14:ligatures w14:val="standardContextual"/>
         </w:rPr>
       </w:pPr>
-      <w:hyperlink w:anchor="_Toc234762126" w:history="1">
+      <w:hyperlink w:anchor="_Toc234762600" w:history="1">
         <w:r>
           <w:rPr>
             <w:rStyle w:val="Hyperlink"/>
@@ -4946,7 +4946,7 @@
             <w:noProof/>
             <w:webHidden/>
           </w:rPr>
-          <w:instrText xml:space="preserve"> PAGEREF _Toc234762126 \h </w:instrText>
+          <w:instrText xml:space="preserve"> PAGEREF _Toc234762600 \h </w:instrText>
         </w:r>
         <w:r>
           <w:rPr>
@@ -4993,7 +4993,7 @@
           <w14:ligatures w14:val="standardContextual"/>
         </w:rPr>
       </w:pPr>
-      <w:hyperlink w:anchor="_Toc234762127" w:history="1">
+      <w:hyperlink w:anchor="_Toc234762601" w:history="1">
         <w:r>
           <w:rPr>
             <w:rStyle w:val="Hyperlink"/>
@@ -5020,7 +5020,7 @@
             <w:noProof/>
             <w:webHidden/>
           </w:rPr>
-          <w:instrText xml:space="preserve"> PAGEREF _Toc234762127 \h </w:instrText>
+          <w:instrText xml:space="preserve"> PAGEREF _Toc234762601 \h </w:instrText>
         </w:r>
         <w:r>
           <w:rPr>
@@ -5067,7 +5067,7 @@
           <w14:ligatures w14:val="standardContextual"/>
         </w:rPr>
       </w:pPr>
-      <w:hyperlink w:anchor="_Toc234762128" w:history="1">
+      <w:hyperlink w:anchor="_Toc234762602" w:history="1">
         <w:r>
           <w:rPr>
             <w:rStyle w:val="Hyperlink"/>
@@ -5094,7 +5094,7 @@
             <w:noProof/>
             <w:webHidden/>
           </w:rPr>
-          <w:instrText xml:space="preserve"> PAGEREF _Toc234762128 \h </w:instrText>
+          <w:instrText xml:space="preserve"> PAGEREF _Toc234762602 \h </w:instrText>
         </w:r>
         <w:r>
           <w:rPr>
@@ -5141,7 +5141,7 @@
           <w14:ligatures w14:val="standardContextual"/>
         </w:rPr>
       </w:pPr>
-      <w:hyperlink w:anchor="_Toc234762129" w:history="1">
+      <w:hyperlink w:anchor="_Toc234762603" w:history="1">
         <w:r>
           <w:rPr>
             <w:rStyle w:val="Hyperlink"/>
@@ -5168,7 +5168,7 @@
             <w:noProof/>
             <w:webHidden/>
           </w:rPr>
-          <w:instrText xml:space="preserve"> PAGEREF _Toc234762129 \h </w:instrText>
+          <w:instrText xml:space="preserve"> PAGEREF _Toc234762603 \h </w:instrText>
         </w:r>
         <w:r>
           <w:rPr>
@@ -5215,7 +5215,7 @@
           <w14:ligatures w14:val="standardContextual"/>
         </w:rPr>
       </w:pPr>
-      <w:hyperlink w:anchor="_Toc234762130" w:history="1">
+      <w:hyperlink w:anchor="_Toc234762604" w:history="1">
         <w:r>
           <w:rPr>
             <w:rStyle w:val="Hyperlink"/>
@@ -5242,7 +5242,7 @@
             <w:noProof/>
             <w:webHidden/>
           </w:rPr>
-          <w:instrText xml:space="preserve"> PAGEREF _Toc234762130 \h </w:instrText>
+          <w:instrText xml:space="preserve"> PAGEREF _Toc234762604 \h </w:instrText>
         </w:r>
         <w:r>
           <w:rPr>
@@ -5289,7 +5289,7 @@
           <w14:ligatures w14:val="standardContextual"/>
         </w:rPr>
       </w:pPr>
-      <w:hyperlink w:anchor="_Toc234762131" w:history="1">
+      <w:hyperlink w:anchor="_Toc234762605" w:history="1">
         <w:r>
           <w:rPr>
             <w:rStyle w:val="Hyperlink"/>
@@ -5316,7 +5316,7 @@
             <w:noProof/>
             <w:webHidden/>
           </w:rPr>
-          <w:instrText xml:space="preserve"> PAGEREF _Toc234762131 \h </w:instrText>
+          <w:instrText xml:space="preserve"> PAGEREF _Toc234762605 \h </w:instrText>
         </w:r>
         <w:r>
           <w:rPr>
@@ -5363,7 +5363,7 @@
           <w14:ligatures w14:val="standardContextual"/>
         </w:rPr>
       </w:pPr>
-      <w:hyperlink w:anchor="_Toc234762132" w:history="1">
+      <w:hyperlink w:anchor="_Toc234762606" w:history="1">
         <w:r>
           <w:rPr>
             <w:rStyle w:val="Hyperlink"/>
@@ -5390,7 +5390,7 @@
             <w:noProof/>
             <w:webHidden/>
           </w:rPr>
-          <w:instrText xml:space="preserve"> PAGEREF _Toc234762132 \h </w:instrText>
+          <w:instrText xml:space="preserve"> PAGEREF _Toc234762606 \h </w:instrText>
         </w:r>
         <w:r>
           <w:rPr>
@@ -5437,7 +5437,7 @@
           <w14:ligatures w14:val="standardContextual"/>
         </w:rPr>
       </w:pPr>
-      <w:hyperlink w:anchor="_Toc234762133" w:history="1">
+      <w:hyperlink w:anchor="_Toc234762607" w:history="1">
         <w:r>
           <w:rPr>
             <w:rStyle w:val="Hyperlink"/>
@@ -5464,7 +5464,7 @@
             <w:noProof/>
             <w:webHidden/>
           </w:rPr>
-          <w:instrText xml:space="preserve"> PAGEREF _Toc234762133 \h </w:instrText>
+          <w:instrText xml:space="preserve"> PAGEREF _Toc234762607 \h </w:instrText>
         </w:r>
         <w:r>
           <w:rPr>
@@ -5511,7 +5511,7 @@
           <w14:ligatures w14:val="standardContextual"/>
         </w:rPr>
       </w:pPr>
-      <w:hyperlink w:anchor="_Toc234762134" w:history="1">
+      <w:hyperlink w:anchor="_Toc234762608" w:history="1">
         <w:r>
           <w:rPr>
             <w:rStyle w:val="Hyperlink"/>
@@ -5538,7 +5538,7 @@
             <w:noProof/>
             <w:webHidden/>
           </w:rPr>
-          <w:instrText xml:space="preserve"> PAGEREF _Toc234762134 \h </w:instrText>
+          <w:instrText xml:space="preserve"> PAGEREF _Toc234762608 \h </w:instrText>
         </w:r>
         <w:r>
           <w:rPr>
@@ -5585,7 +5585,7 @@
           <w14:ligatures w14:val="standardContextual"/>
         </w:rPr>
       </w:pPr>
-      <w:hyperlink w:anchor="_Toc234762135" w:history="1">
+      <w:hyperlink w:anchor="_Toc234762609" w:history="1">
         <w:r>
           <w:rPr>
             <w:rStyle w:val="Hyperlink"/>
@@ -5612,7 +5612,7 @@
             <w:noProof/>
             <w:webHidden/>
           </w:rPr>
-          <w:instrText xml:space="preserve"> PAGEREF _Toc234762135 \h </w:instrText>
+          <w:instrText xml:space="preserve"> PAGEREF _Toc234762609 \h </w:instrText>
         </w:r>
         <w:r>
           <w:rPr>
@@ -5659,7 +5659,7 @@
           <w14:ligatures w14:val="standardContextual"/>
         </w:rPr>
       </w:pPr>
-      <w:hyperlink w:anchor="_Toc234762136" w:history="1">
+      <w:hyperlink w:anchor="_Toc234762610" w:history="1">
         <w:r>
           <w:rPr>
             <w:rStyle w:val="Hyperlink"/>
@@ -5686,7 +5686,7 @@
             <w:noProof/>
             <w:webHidden/>
           </w:rPr>
-          <w:instrText xml:space="preserve"> PAGEREF _Toc234762136 \h </w:instrText>
+          <w:instrText xml:space="preserve"> PAGEREF _Toc234762610 \h </w:instrText>
         </w:r>
         <w:r>
           <w:rPr>
@@ -5733,7 +5733,7 @@
           <w14:ligatures w14:val="standardContextual"/>
         </w:rPr>
       </w:pPr>
-      <w:hyperlink w:anchor="_Toc234762137" w:history="1">
+      <w:hyperlink w:anchor="_Toc234762611" w:history="1">
         <w:r>
           <w:rPr>
             <w:rStyle w:val="Hyperlink"/>
@@ -5760,7 +5760,7 @@
             <w:noProof/>
             <w:webHidden/>
           </w:rPr>
-          <w:instrText xml:space="preserve"> PAGEREF _Toc234762137 \h </w:instrText>
+          <w:instrText xml:space="preserve"> PAGEREF _Toc234762611 \h </w:instrText>
         </w:r>
         <w:r>
           <w:rPr>
@@ -5807,7 +5807,7 @@
           <w14:ligatures w14:val="standardContextual"/>
         </w:rPr>
       </w:pPr>
-      <w:hyperlink w:anchor="_Toc234762138" w:history="1">
+      <w:hyperlink w:anchor="_Toc234762612" w:history="1">
         <w:r>
           <w:rPr>
             <w:rStyle w:val="Hyperlink"/>
@@ -5834,7 +5834,7 @@
             <w:noProof/>
             <w:webHidden/>
           </w:rPr>
-          <w:instrText xml:space="preserve"> PAGEREF _Toc234762138 \h </w:instrText>
+          <w:instrText xml:space="preserve"> PAGEREF _Toc234762612 \h </w:instrText>
         </w:r>
         <w:r>
           <w:rPr>
@@ -5881,7 +5881,7 @@
           <w14:ligatures w14:val="standardContextual"/>
         </w:rPr>
       </w:pPr>
-      <w:hyperlink w:anchor="_Toc234762139" w:history="1">
+      <w:hyperlink w:anchor="_Toc234762613" w:history="1">
         <w:r>
           <w:rPr>
             <w:rStyle w:val="Hyperlink"/>
@@ -5908,7 +5908,7 @@
             <w:noProof/>
             <w:webHidden/>
           </w:rPr>
-          <w:instrText xml:space="preserve"> PAGEREF _Toc234762139 \h </w:instrText>
+          <w:instrText xml:space="preserve"> PAGEREF _Toc234762613 \h </w:instrText>
         </w:r>
         <w:r>
           <w:rPr>
@@ -5955,7 +5955,7 @@
           <w14:ligatures w14:val="standardContextual"/>
         </w:rPr>
       </w:pPr>
-      <w:hyperlink w:anchor="_Toc234762140" w:history="1">
+      <w:hyperlink w:anchor="_Toc234762614" w:history="1">
         <w:r>
           <w:rPr>
             <w:rStyle w:val="Hyperlink"/>
@@ -5982,7 +5982,7 @@
             <w:noProof/>
             <w:webHidden/>
           </w:rPr>
-          <w:instrText xml:space="preserve"> PAGEREF _Toc234762140 \h </w:instrText>
+          <w:instrText xml:space="preserve"> PAGEREF _Toc234762614 \h </w:instrText>
         </w:r>
         <w:r>
           <w:rPr>
@@ -6029,7 +6029,7 @@
           <w14:ligatures w14:val="standardContextual"/>
         </w:rPr>
       </w:pPr>
-      <w:hyperlink w:anchor="_Toc234762141" w:history="1">
+      <w:hyperlink w:anchor="_Toc234762615" w:history="1">
         <w:r>
           <w:rPr>
             <w:rStyle w:val="Hyperlink"/>
@@ -6056,7 +6056,7 @@
             <w:noProof/>
             <w:webHidden/>
           </w:rPr>
-          <w:instrText xml:space="preserve"> PAGEREF _Toc234762141 \h </w:instrText>
+          <w:instrText xml:space="preserve"> PAGEREF _Toc234762615 \h </w:instrText>
         </w:r>
         <w:r>
           <w:rPr>
@@ -6103,7 +6103,7 @@
           <w14:ligatures w14:val="standardContextual"/>
         </w:rPr>
       </w:pPr>
-      <w:hyperlink w:anchor="_Toc234762142" w:history="1">
+      <w:hyperlink w:anchor="_Toc234762616" w:history="1">
         <w:r>
           <w:rPr>
             <w:rStyle w:val="Hyperlink"/>
@@ -6130,7 +6130,7 @@
             <w:noProof/>
             <w:webHidden/>
           </w:rPr>
-          <w:instrText xml:space="preserve"> PAGEREF _Toc234762142 \h </w:instrText>
+          <w:instrText xml:space="preserve"> PAGEREF _Toc234762616 \h </w:instrText>
         </w:r>
         <w:r>
           <w:rPr>
@@ -6177,7 +6177,7 @@
           <w14:ligatures w14:val="standardContextual"/>
         </w:rPr>
       </w:pPr>
-      <w:hyperlink w:anchor="_Toc234762143" w:history="1">
+      <w:hyperlink w:anchor="_Toc234762617" w:history="1">
         <w:r>
           <w:rPr>
             <w:rStyle w:val="Hyperlink"/>
@@ -6204,7 +6204,7 @@
             <w:noProof/>
             <w:webHidden/>
           </w:rPr>
-          <w:instrText xml:space="preserve"> PAGEREF _Toc234762143 \h </w:instrText>
+          <w:instrText xml:space="preserve"> PAGEREF _Toc234762617 \h </w:instrText>
         </w:r>
         <w:r>
           <w:rPr>
@@ -6251,7 +6251,7 @@
           <w14:ligatures w14:val="standardContextual"/>
         </w:rPr>
       </w:pPr>
-      <w:hyperlink w:anchor="_Toc234762144" w:history="1">
+      <w:hyperlink w:anchor="_Toc234762618" w:history="1">
         <w:r>
           <w:rPr>
             <w:rStyle w:val="Hyperlink"/>
@@ -6278,7 +6278,7 @@
             <w:noProof/>
             <w:webHidden/>
           </w:rPr>
-          <w:instrText xml:space="preserve"> PAGEREF _Toc234762144 \h </w:instrText>
+          <w:instrText xml:space="preserve"> PAGEREF _Toc234762618 \h </w:instrText>
         </w:r>
         <w:r>
           <w:rPr>
@@ -6325,7 +6325,7 @@
           <w14:ligatures w14:val="standardContextual"/>
         </w:rPr>
       </w:pPr>
-      <w:hyperlink w:anchor="_Toc234762145" w:history="1">
+      <w:hyperlink w:anchor="_Toc234762619" w:history="1">
         <w:r>
           <w:rPr>
             <w:rStyle w:val="Hyperlink"/>
@@ -6352,7 +6352,7 @@
             <w:noProof/>
             <w:webHidden/>
           </w:rPr>
-          <w:instrText xml:space="preserve"> PAGEREF _Toc234762145 \h </w:instrText>
+          <w:instrText xml:space="preserve"> PAGEREF _Toc234762619 \h </w:instrText>
         </w:r>
         <w:r>
           <w:rPr>
@@ -6399,7 +6399,7 @@
           <w14:ligatures w14:val="standardContextual"/>
         </w:rPr>
       </w:pPr>
-      <w:hyperlink w:anchor="_Toc234762146" w:history="1">
+      <w:hyperlink w:anchor="_Toc234762620" w:history="1">
         <w:r>
           <w:rPr>
             <w:rStyle w:val="Hyperlink"/>
@@ -6426,7 +6426,7 @@
             <w:noProof/>
             <w:webHidden/>
           </w:rPr>
-          <w:instrText xml:space="preserve"> PAGEREF _Toc234762146 \h </w:instrText>
+          <w:instrText xml:space="preserve"> PAGEREF _Toc234762620 \h </w:instrText>
         </w:r>
         <w:r>
           <w:rPr>
@@ -6473,7 +6473,7 @@
           <w14:ligatures w14:val="standardContextual"/>
         </w:rPr>
       </w:pPr>
-      <w:hyperlink w:anchor="_Toc234762147" w:history="1">
+      <w:hyperlink w:anchor="_Toc234762621" w:history="1">
         <w:r>
           <w:rPr>
             <w:rStyle w:val="Hyperlink"/>
@@ -6500,7 +6500,7 @@
             <w:noProof/>
             <w:webHidden/>
           </w:rPr>
-          <w:instrText xml:space="preserve"> PAGEREF _Toc234762147 \h </w:instrText>
+          <w:instrText xml:space="preserve"> PAGEREF _Toc234762621 \h </w:instrText>
         </w:r>
         <w:r>
           <w:rPr>
@@ -6547,7 +6547,7 @@
           <w14:ligatures w14:val="standardContextual"/>
         </w:rPr>
       </w:pPr>
-      <w:hyperlink w:anchor="_Toc234762148" w:history="1">
+      <w:hyperlink w:anchor="_Toc234762622" w:history="1">
         <w:r>
           <w:rPr>
             <w:rStyle w:val="Hyperlink"/>
@@ -6574,7 +6574,7 @@
             <w:noProof/>
             <w:webHidden/>
           </w:rPr>
-          <w:instrText xml:space="preserve"> PAGEREF _Toc234762148 \h </w:instrText>
+          <w:instrText xml:space="preserve"> PAGEREF _Toc234762622 \h </w:instrText>
         </w:r>
         <w:r>
           <w:rPr>
@@ -6621,7 +6621,7 @@
           <w14:ligatures w14:val="standardContextual"/>
         </w:rPr>
       </w:pPr>
-      <w:hyperlink w:anchor="_Toc234762149" w:history="1">
+      <w:hyperlink w:anchor="_Toc234762623" w:history="1">
         <w:r>
           <w:rPr>
             <w:rStyle w:val="Hyperlink"/>
@@ -6648,7 +6648,7 @@
             <w:noProof/>
             <w:webHidden/>
           </w:rPr>
-          <w:instrText xml:space="preserve"> PAGEREF _Toc234762149 \h </w:instrText>
+          <w:instrText xml:space="preserve"> PAGEREF _Toc234762623 \h </w:instrText>
         </w:r>
         <w:r>
           <w:rPr>
@@ -6695,7 +6695,7 @@
           <w14:ligatures w14:val="standardContextual"/>
         </w:rPr>
       </w:pPr>
-      <w:hyperlink w:anchor="_Toc234762150" w:history="1">
+      <w:hyperlink w:anchor="_Toc234762624" w:history="1">
         <w:r>
           <w:rPr>
             <w:rStyle w:val="Hyperlink"/>
@@ -6722,7 +6722,7 @@
             <w:noProof/>
             <w:webHidden/>
           </w:rPr>
-          <w:instrText xml:space="preserve"> PAGEREF _Toc234762150 \h </w:instrText>
+          <w:instrText xml:space="preserve"> PAGEREF _Toc234762624 \h </w:instrText>
         </w:r>
         <w:r>
           <w:rPr>
@@ -6769,7 +6769,7 @@
           <w14:ligatures w14:val="standardContextual"/>
         </w:rPr>
       </w:pPr>
-      <w:hyperlink w:anchor="_Toc234762151" w:history="1">
+      <w:hyperlink w:anchor="_Toc234762625" w:history="1">
         <w:r>
           <w:rPr>
             <w:rStyle w:val="Hyperlink"/>
@@ -6796,7 +6796,7 @@
             <w:noProof/>
             <w:webHidden/>
           </w:rPr>
-          <w:instrText xml:space="preserve"> PAGEREF _Toc234762151 \h </w:instrText>
+          <w:instrText xml:space="preserve"> PAGEREF _Toc234762625 \h </w:instrText>
         </w:r>
         <w:r>
           <w:rPr>
@@ -6849,7 +6849,7 @@
       <w:pPr>
         <w:pStyle w:val="Heading1"/>
       </w:pPr>
-      <w:bookmarkStart w:id="5" w:name="_Toc234762075"/>
+      <w:bookmarkStart w:id="5" w:name="_Toc234762549"/>
       <w:r>
         <w:lastRenderedPageBreak/>
         <w:t>List of Figures</w:t>
@@ -7709,7 +7709,7 @@
       <w:pPr>
         <w:pStyle w:val="Heading1"/>
       </w:pPr>
-      <w:bookmarkStart w:id="6" w:name="_Toc234762076"/>
+      <w:bookmarkStart w:id="6" w:name="_Toc234762550"/>
       <w:r>
         <w:lastRenderedPageBreak/>
         <w:t>List of Tables</w:t>
@@ -8211,7 +8211,7 @@
       <w:pPr>
         <w:pStyle w:val="Heading1"/>
       </w:pPr>
-      <w:bookmarkStart w:id="7" w:name="_Toc234762077"/>
+      <w:bookmarkStart w:id="7" w:name="_Toc234762551"/>
       <w:r>
         <w:lastRenderedPageBreak/>
         <w:t>Abbreviations and Terminology</w:t>
@@ -8727,7 +8727,7 @@
       <w:pPr>
         <w:pStyle w:val="Heading1"/>
       </w:pPr>
-      <w:bookmarkStart w:id="8" w:name="_Toc234762078"/>
+      <w:bookmarkStart w:id="8" w:name="_Toc234762552"/>
       <w:r>
         <w:t>Executive Summary</w:t>
       </w:r>
@@ -8812,7 +8812,7 @@
       <w:pPr>
         <w:pStyle w:val="Heading1"/>
       </w:pPr>
-      <w:bookmarkStart w:id="9" w:name="_Toc234762079"/>
+      <w:bookmarkStart w:id="9" w:name="_Toc234762553"/>
       <w:r>
         <w:t>1.1 Background of Online Food Ordering</w:t>
       </w:r>
@@ -8865,7 +8865,7 @@
       <w:pPr>
         <w:pStyle w:val="Heading1"/>
       </w:pPr>
-      <w:bookmarkStart w:id="10" w:name="_Toc234762080"/>
+      <w:bookmarkStart w:id="10" w:name="_Toc234762554"/>
       <w:r>
         <w:t>1.2 Problem Statement</w:t>
       </w:r>
@@ -8918,7 +8918,7 @@
       <w:pPr>
         <w:pStyle w:val="Heading1"/>
       </w:pPr>
-      <w:bookmarkStart w:id="11" w:name="_Toc234762081"/>
+      <w:bookmarkStart w:id="11" w:name="_Toc234762555"/>
       <w:r>
         <w:t>1.3 Aim of the Project</w:t>
       </w:r>
@@ -8971,7 +8971,7 @@
       <w:pPr>
         <w:pStyle w:val="Heading1"/>
       </w:pPr>
-      <w:bookmarkStart w:id="12" w:name="_Toc234762082"/>
+      <w:bookmarkStart w:id="12" w:name="_Toc234762556"/>
       <w:r>
         <w:t>1.4 Project Objectives</w:t>
       </w:r>
@@ -9072,7 +9072,7 @@
       <w:pPr>
         <w:pStyle w:val="Heading1"/>
       </w:pPr>
-      <w:bookmarkStart w:id="13" w:name="_Toc234762083"/>
+      <w:bookmarkStart w:id="13" w:name="_Toc234762557"/>
       <w:r>
         <w:t>1.5 Scope and Boundaries</w:t>
       </w:r>
@@ -9125,7 +9125,7 @@
       <w:pPr>
         <w:pStyle w:val="Heading1"/>
       </w:pPr>
-      <w:bookmarkStart w:id="14" w:name="_Toc234762084"/>
+      <w:bookmarkStart w:id="14" w:name="_Toc234762558"/>
       <w:r>
         <w:t>1.6 Significance of the Project</w:t>
       </w:r>
@@ -9178,7 +9178,7 @@
       <w:pPr>
         <w:pStyle w:val="Heading1"/>
       </w:pPr>
-      <w:bookmarkStart w:id="15" w:name="_Toc234762085"/>
+      <w:bookmarkStart w:id="15" w:name="_Toc234762559"/>
       <w:r>
         <w:t>2.1 Existing Manual System</w:t>
       </w:r>
@@ -9231,7 +9231,7 @@
       <w:pPr>
         <w:pStyle w:val="Heading1"/>
       </w:pPr>
-      <w:bookmarkStart w:id="16" w:name="_Toc234762086"/>
+      <w:bookmarkStart w:id="16" w:name="_Toc234762560"/>
       <w:r>
         <w:t>2.2 Limitations of Existing Approaches</w:t>
       </w:r>
@@ -9284,7 +9284,7 @@
       <w:pPr>
         <w:pStyle w:val="Heading1"/>
       </w:pPr>
-      <w:bookmarkStart w:id="17" w:name="_Toc234762087"/>
+      <w:bookmarkStart w:id="17" w:name="_Toc234762561"/>
       <w:r>
         <w:t>2.3 Proposed System</w:t>
       </w:r>
@@ -9337,7 +9337,7 @@
       <w:pPr>
         <w:pStyle w:val="Heading1"/>
       </w:pPr>
-      <w:bookmarkStart w:id="18" w:name="_Toc234762088"/>
+      <w:bookmarkStart w:id="18" w:name="_Toc234762562"/>
       <w:r>
         <w:t>2.4 Technical Feasibility</w:t>
       </w:r>
@@ -9390,7 +9390,7 @@
       <w:pPr>
         <w:pStyle w:val="Heading1"/>
       </w:pPr>
-      <w:bookmarkStart w:id="19" w:name="_Toc234762089"/>
+      <w:bookmarkStart w:id="19" w:name="_Toc234762563"/>
       <w:r>
         <w:t>2.5 Economic Feasibility</w:t>
       </w:r>
@@ -9443,7 +9443,7 @@
       <w:pPr>
         <w:pStyle w:val="Heading1"/>
       </w:pPr>
-      <w:bookmarkStart w:id="20" w:name="_Toc234762090"/>
+      <w:bookmarkStart w:id="20" w:name="_Toc234762564"/>
       <w:r>
         <w:t>2.6 Operational and Schedule Feasibility</w:t>
       </w:r>
@@ -9496,7 +9496,7 @@
       <w:pPr>
         <w:pStyle w:val="Heading1"/>
       </w:pPr>
-      <w:bookmarkStart w:id="21" w:name="_Toc234762091"/>
+      <w:bookmarkStart w:id="21" w:name="_Toc234762565"/>
       <w:r>
         <w:t>3.1 Stakeholder Identification</w:t>
       </w:r>
@@ -9549,7 +9549,7 @@
       <w:pPr>
         <w:pStyle w:val="Heading1"/>
       </w:pPr>
-      <w:bookmarkStart w:id="22" w:name="_Toc234762092"/>
+      <w:bookmarkStart w:id="22" w:name="_Toc234762566"/>
       <w:r>
         <w:t>3.2 Customer Functional Requirements</w:t>
       </w:r>
@@ -9602,7 +9602,7 @@
       <w:pPr>
         <w:pStyle w:val="Heading1"/>
       </w:pPr>
-      <w:bookmarkStart w:id="23" w:name="_Toc234762093"/>
+      <w:bookmarkStart w:id="23" w:name="_Toc234762567"/>
       <w:r>
         <w:t>3.3 Administrative Requirements</w:t>
       </w:r>
@@ -10261,7 +10261,7 @@
       <w:pPr>
         <w:pStyle w:val="Heading1"/>
       </w:pPr>
-      <w:bookmarkStart w:id="24" w:name="_Toc234762094"/>
+      <w:bookmarkStart w:id="24" w:name="_Toc234762568"/>
       <w:r>
         <w:t>3.4 Kitchen and Delivery Requirements</w:t>
       </w:r>
@@ -10314,7 +10314,7 @@
       <w:pPr>
         <w:pStyle w:val="Heading1"/>
       </w:pPr>
-      <w:bookmarkStart w:id="25" w:name="_Toc234762095"/>
+      <w:bookmarkStart w:id="25" w:name="_Toc234762569"/>
       <w:r>
         <w:t>3.5 Non-Functional Requirements</w:t>
       </w:r>
@@ -10696,7 +10696,7 @@
       <w:pPr>
         <w:pStyle w:val="Heading1"/>
       </w:pPr>
-      <w:bookmarkStart w:id="26" w:name="_Toc234762096"/>
+      <w:bookmarkStart w:id="26" w:name="_Toc234762570"/>
       <w:r>
         <w:t>3.6 Hardware and Software Requirements</w:t>
       </w:r>
@@ -11131,7 +11131,7 @@
       <w:pPr>
         <w:pStyle w:val="Heading1"/>
       </w:pPr>
-      <w:bookmarkStart w:id="27" w:name="_Toc234762097"/>
+      <w:bookmarkStart w:id="27" w:name="_Toc234762571"/>
       <w:r>
         <w:t>4.1 System Context</w:t>
       </w:r>
@@ -11170,7 +11170,7 @@
           <w:noProof/>
         </w:rPr>
         <w:drawing>
-          <wp:inline distT="0" distB="0" distL="0" distR="0" wp14:anchorId="3B71A24F" wp14:editId="116C958E">
+          <wp:inline distT="0" distB="0" distL="0" distR="0" wp14:anchorId="144C67C2" wp14:editId="523543AF">
             <wp:extent cx="6126480" cy="3460047"/>
             <wp:effectExtent l="0" t="0" r="0" b="0"/>
             <wp:docPr id="1" name="Picture 1"/>
@@ -11249,7 +11249,7 @@
       <w:pPr>
         <w:pStyle w:val="Heading1"/>
       </w:pPr>
-      <w:bookmarkStart w:id="28" w:name="_Toc234762098"/>
+      <w:bookmarkStart w:id="28" w:name="_Toc234762572"/>
       <w:r>
         <w:t>4.2 Layered Architecture</w:t>
       </w:r>
@@ -11288,7 +11288,7 @@
           <w:noProof/>
         </w:rPr>
         <w:drawing>
-          <wp:inline distT="0" distB="0" distL="0" distR="0" wp14:anchorId="0DB22ECC" wp14:editId="07BA0328">
+          <wp:inline distT="0" distB="0" distL="0" distR="0" wp14:anchorId="607271FB" wp14:editId="218B891F">
             <wp:extent cx="6126480" cy="3460047"/>
             <wp:effectExtent l="0" t="0" r="0" b="0"/>
             <wp:docPr id="2" name="Picture 2"/>
@@ -11367,7 +11367,7 @@
       <w:pPr>
         <w:pStyle w:val="Heading1"/>
       </w:pPr>
-      <w:bookmarkStart w:id="29" w:name="_Toc234762099"/>
+      <w:bookmarkStart w:id="29" w:name="_Toc234762573"/>
       <w:r>
         <w:t>4.3 Customer Use Cases</w:t>
       </w:r>
@@ -11406,7 +11406,7 @@
           <w:noProof/>
         </w:rPr>
         <w:drawing>
-          <wp:inline distT="0" distB="0" distL="0" distR="0" wp14:anchorId="0617CE1B" wp14:editId="5A4A9A9A">
+          <wp:inline distT="0" distB="0" distL="0" distR="0" wp14:anchorId="01182310" wp14:editId="1605C427">
             <wp:extent cx="6126480" cy="3460047"/>
             <wp:effectExtent l="0" t="0" r="0" b="0"/>
             <wp:docPr id="3" name="Picture 3"/>
@@ -11485,7 +11485,7 @@
       <w:pPr>
         <w:pStyle w:val="Heading1"/>
       </w:pPr>
-      <w:bookmarkStart w:id="30" w:name="_Toc234762100"/>
+      <w:bookmarkStart w:id="30" w:name="_Toc234762574"/>
       <w:r>
         <w:t>4.4 Staff Use Cases</w:t>
       </w:r>
@@ -11524,7 +11524,7 @@
           <w:noProof/>
         </w:rPr>
         <w:drawing>
-          <wp:inline distT="0" distB="0" distL="0" distR="0" wp14:anchorId="7B19FA02" wp14:editId="2E99066E">
+          <wp:inline distT="0" distB="0" distL="0" distR="0" wp14:anchorId="7642CD81" wp14:editId="7BD2C230">
             <wp:extent cx="6126480" cy="3460047"/>
             <wp:effectExtent l="0" t="0" r="0" b="0"/>
             <wp:docPr id="4" name="Picture 4"/>
@@ -11603,7 +11603,7 @@
       <w:pPr>
         <w:pStyle w:val="Heading1"/>
       </w:pPr>
-      <w:bookmarkStart w:id="31" w:name="_Toc234762101"/>
+      <w:bookmarkStart w:id="31" w:name="_Toc234762575"/>
       <w:r>
         <w:t>4.5 Context-Level Data Flow</w:t>
       </w:r>
@@ -11642,7 +11642,7 @@
           <w:noProof/>
         </w:rPr>
         <w:drawing>
-          <wp:inline distT="0" distB="0" distL="0" distR="0" wp14:anchorId="3F986C6C" wp14:editId="5584497E">
+          <wp:inline distT="0" distB="0" distL="0" distR="0" wp14:anchorId="5F709875" wp14:editId="7D95A56E">
             <wp:extent cx="6126480" cy="3460047"/>
             <wp:effectExtent l="0" t="0" r="0" b="0"/>
             <wp:docPr id="5" name="Picture 5"/>
@@ -11721,7 +11721,7 @@
       <w:pPr>
         <w:pStyle w:val="Heading1"/>
       </w:pPr>
-      <w:bookmarkStart w:id="32" w:name="_Toc234762102"/>
+      <w:bookmarkStart w:id="32" w:name="_Toc234762576"/>
       <w:r>
         <w:t>4.6 Detailed Order Data Flow</w:t>
       </w:r>
@@ -11760,7 +11760,7 @@
           <w:noProof/>
         </w:rPr>
         <w:drawing>
-          <wp:inline distT="0" distB="0" distL="0" distR="0" wp14:anchorId="4F0453F2" wp14:editId="74153757">
+          <wp:inline distT="0" distB="0" distL="0" distR="0" wp14:anchorId="70F8607F" wp14:editId="039AEBF1">
             <wp:extent cx="6126480" cy="3460047"/>
             <wp:effectExtent l="0" t="0" r="0" b="0"/>
             <wp:docPr id="6" name="Picture 6"/>
@@ -11839,7 +11839,7 @@
       <w:pPr>
         <w:pStyle w:val="Heading1"/>
       </w:pPr>
-      <w:bookmarkStart w:id="33" w:name="_Toc234762103"/>
+      <w:bookmarkStart w:id="33" w:name="_Toc234762577"/>
       <w:r>
         <w:t>4.7 Navigation Design</w:t>
       </w:r>
@@ -11878,7 +11878,7 @@
           <w:noProof/>
         </w:rPr>
         <w:drawing>
-          <wp:inline distT="0" distB="0" distL="0" distR="0" wp14:anchorId="6CF8E8EF" wp14:editId="240CFB0F">
+          <wp:inline distT="0" distB="0" distL="0" distR="0" wp14:anchorId="695A1D24" wp14:editId="411CEECE">
             <wp:extent cx="6126480" cy="3460047"/>
             <wp:effectExtent l="0" t="0" r="0" b="0"/>
             <wp:docPr id="7" name="Picture 7"/>
@@ -11957,7 +11957,7 @@
       <w:pPr>
         <w:pStyle w:val="Heading1"/>
       </w:pPr>
-      <w:bookmarkStart w:id="34" w:name="_Toc234762104"/>
+      <w:bookmarkStart w:id="34" w:name="_Toc234762578"/>
       <w:r>
         <w:t>4.8 Order State Machine</w:t>
       </w:r>
@@ -11996,7 +11996,7 @@
           <w:noProof/>
         </w:rPr>
         <w:drawing>
-          <wp:inline distT="0" distB="0" distL="0" distR="0" wp14:anchorId="21082706" wp14:editId="50CDC9FA">
+          <wp:inline distT="0" distB="0" distL="0" distR="0" wp14:anchorId="0E0230ED" wp14:editId="051BB0A5">
             <wp:extent cx="6126480" cy="3460047"/>
             <wp:effectExtent l="0" t="0" r="0" b="0"/>
             <wp:docPr id="8" name="Picture 8"/>
@@ -12075,7 +12075,7 @@
       <w:pPr>
         <w:pStyle w:val="Heading1"/>
       </w:pPr>
-      <w:bookmarkStart w:id="35" w:name="_Toc234762105"/>
+      <w:bookmarkStart w:id="35" w:name="_Toc234762579"/>
       <w:r>
         <w:t>5.1 Database Design Objectives</w:t>
       </w:r>
@@ -12128,7 +12128,7 @@
       <w:pPr>
         <w:pStyle w:val="Heading1"/>
       </w:pPr>
-      <w:bookmarkStart w:id="36" w:name="_Toc234762106"/>
+      <w:bookmarkStart w:id="36" w:name="_Toc234762580"/>
       <w:r>
         <w:t>5.2 Entity Relationship Model</w:t>
       </w:r>
@@ -12167,7 +12167,7 @@
           <w:noProof/>
         </w:rPr>
         <w:drawing>
-          <wp:inline distT="0" distB="0" distL="0" distR="0" wp14:anchorId="01CA4986" wp14:editId="48735B04">
+          <wp:inline distT="0" distB="0" distL="0" distR="0" wp14:anchorId="1254546E" wp14:editId="4837B310">
             <wp:extent cx="6126480" cy="3460047"/>
             <wp:effectExtent l="0" t="0" r="0" b="0"/>
             <wp:docPr id="9" name="Picture 9"/>
@@ -12246,7 +12246,7 @@
       <w:pPr>
         <w:pStyle w:val="Heading1"/>
       </w:pPr>
-      <w:bookmarkStart w:id="37" w:name="_Toc234762107"/>
+      <w:bookmarkStart w:id="37" w:name="_Toc234762581"/>
       <w:r>
         <w:t>5.3 User and Address Tables</w:t>
       </w:r>
@@ -12299,7 +12299,7 @@
       <w:pPr>
         <w:pStyle w:val="Heading1"/>
       </w:pPr>
-      <w:bookmarkStart w:id="38" w:name="_Toc234762108"/>
+      <w:bookmarkStart w:id="38" w:name="_Toc234762582"/>
       <w:r>
         <w:t>5.4 Menu and Category Tables</w:t>
       </w:r>
@@ -12352,7 +12352,7 @@
       <w:pPr>
         <w:pStyle w:val="Heading1"/>
       </w:pPr>
-      <w:bookmarkStart w:id="39" w:name="_Toc234762109"/>
+      <w:bookmarkStart w:id="39" w:name="_Toc234762583"/>
       <w:r>
         <w:t>5.5 Order and Order-Item Tables</w:t>
       </w:r>
@@ -12405,7 +12405,7 @@
       <w:pPr>
         <w:pStyle w:val="Heading1"/>
       </w:pPr>
-      <w:bookmarkStart w:id="40" w:name="_Toc234762110"/>
+      <w:bookmarkStart w:id="40" w:name="_Toc234762584"/>
       <w:r>
         <w:t>5.6 Supporting Tables</w:t>
       </w:r>
@@ -12840,7 +12840,7 @@
       <w:pPr>
         <w:pStyle w:val="Heading1"/>
       </w:pPr>
-      <w:bookmarkStart w:id="41" w:name="_Toc234762111"/>
+      <w:bookmarkStart w:id="41" w:name="_Toc234762585"/>
       <w:r>
         <w:t>6.1 Project Structure</w:t>
       </w:r>
@@ -12879,7 +12879,7 @@
           <w:noProof/>
         </w:rPr>
         <w:drawing>
-          <wp:inline distT="0" distB="0" distL="0" distR="0" wp14:anchorId="0C779149" wp14:editId="620D460E">
+          <wp:inline distT="0" distB="0" distL="0" distR="0" wp14:anchorId="1BDD4202" wp14:editId="123A0E5C">
             <wp:extent cx="6126480" cy="3460047"/>
             <wp:effectExtent l="0" t="0" r="0" b="0"/>
             <wp:docPr id="10" name="Picture 10"/>
@@ -13301,7 +13301,7 @@
       <w:pPr>
         <w:pStyle w:val="Heading1"/>
       </w:pPr>
-      <w:bookmarkStart w:id="42" w:name="_Toc234762112"/>
+      <w:bookmarkStart w:id="42" w:name="_Toc234762586"/>
       <w:r>
         <w:t>6.2 Authentication Implementation</w:t>
       </w:r>
@@ -13340,7 +13340,7 @@
           <w:noProof/>
         </w:rPr>
         <w:drawing>
-          <wp:inline distT="0" distB="0" distL="0" distR="0" wp14:anchorId="32456B31" wp14:editId="2C2E040E">
+          <wp:inline distT="0" distB="0" distL="0" distR="0" wp14:anchorId="5845ABC6" wp14:editId="03DBA84B">
             <wp:extent cx="6126480" cy="3460047"/>
             <wp:effectExtent l="0" t="0" r="0" b="0"/>
             <wp:docPr id="11" name="Picture 11"/>
@@ -13419,7 +13419,7 @@
       <w:pPr>
         <w:pStyle w:val="Heading1"/>
       </w:pPr>
-      <w:bookmarkStart w:id="43" w:name="_Toc234762113"/>
+      <w:bookmarkStart w:id="43" w:name="_Toc234762587"/>
       <w:r>
         <w:t>6.3 Customer Interface Implementation</w:t>
       </w:r>
@@ -13472,7 +13472,7 @@
       <w:pPr>
         <w:pStyle w:val="Heading1"/>
       </w:pPr>
-      <w:bookmarkStart w:id="44" w:name="_Toc234762114"/>
+      <w:bookmarkStart w:id="44" w:name="_Toc234762588"/>
       <w:r>
         <w:t>6.4 Cart, Coupon and Checkout Logic</w:t>
       </w:r>
@@ -13511,7 +13511,7 @@
           <w:noProof/>
         </w:rPr>
         <w:drawing>
-          <wp:inline distT="0" distB="0" distL="0" distR="0" wp14:anchorId="7C5E4AF9" wp14:editId="486F3402">
+          <wp:inline distT="0" distB="0" distL="0" distR="0" wp14:anchorId="1CD4052A" wp14:editId="0CD6CD6A">
             <wp:extent cx="6126480" cy="3460047"/>
             <wp:effectExtent l="0" t="0" r="0" b="0"/>
             <wp:docPr id="12" name="Picture 12"/>
@@ -13590,7 +13590,7 @@
       <w:pPr>
         <w:pStyle w:val="Heading1"/>
       </w:pPr>
-      <w:bookmarkStart w:id="45" w:name="_Toc234762115"/>
+      <w:bookmarkStart w:id="45" w:name="_Toc234762589"/>
       <w:r>
         <w:t>6.5 Administrative Dashboard</w:t>
       </w:r>
@@ -13643,7 +13643,7 @@
       <w:pPr>
         <w:pStyle w:val="Heading1"/>
       </w:pPr>
-      <w:bookmarkStart w:id="46" w:name="_Toc234762116"/>
+      <w:bookmarkStart w:id="46" w:name="_Toc234762590"/>
       <w:r>
         <w:t>6.6 Kitchen Dashboard</w:t>
       </w:r>
@@ -13696,7 +13696,7 @@
       <w:pPr>
         <w:pStyle w:val="Heading1"/>
       </w:pPr>
-      <w:bookmarkStart w:id="47" w:name="_Toc234762117"/>
+      <w:bookmarkStart w:id="47" w:name="_Toc234762591"/>
       <w:r>
         <w:t>6.7 Delivery Dashboard</w:t>
       </w:r>
@@ -13749,7 +13749,7 @@
       <w:pPr>
         <w:pStyle w:val="Heading1"/>
       </w:pPr>
-      <w:bookmarkStart w:id="48" w:name="_Toc234762118"/>
+      <w:bookmarkStart w:id="48" w:name="_Toc234762592"/>
       <w:r>
         <w:t>6.8 Reporting and Settings</w:t>
       </w:r>
@@ -13802,7 +13802,7 @@
       <w:pPr>
         <w:pStyle w:val="Heading1"/>
       </w:pPr>
-      <w:bookmarkStart w:id="49" w:name="_Toc234762119"/>
+      <w:bookmarkStart w:id="49" w:name="_Toc234762593"/>
       <w:r>
         <w:t>7.1 Authentication and Authorization</w:t>
       </w:r>
@@ -13855,7 +13855,7 @@
       <w:pPr>
         <w:pStyle w:val="Heading1"/>
       </w:pPr>
-      <w:bookmarkStart w:id="50" w:name="_Toc234762120"/>
+      <w:bookmarkStart w:id="50" w:name="_Toc234762594"/>
       <w:r>
         <w:t>7.2 CSRF and Session Security</w:t>
       </w:r>
@@ -13894,7 +13894,7 @@
           <w:noProof/>
         </w:rPr>
         <w:drawing>
-          <wp:inline distT="0" distB="0" distL="0" distR="0" wp14:anchorId="6D2B0CD0" wp14:editId="27976A78">
+          <wp:inline distT="0" distB="0" distL="0" distR="0" wp14:anchorId="279314FB" wp14:editId="5098A0DF">
             <wp:extent cx="6126480" cy="3460047"/>
             <wp:effectExtent l="0" t="0" r="0" b="0"/>
             <wp:docPr id="13" name="Picture 13"/>
@@ -13973,7 +13973,7 @@
       <w:pPr>
         <w:pStyle w:val="Heading1"/>
       </w:pPr>
-      <w:bookmarkStart w:id="51" w:name="_Toc234762121"/>
+      <w:bookmarkStart w:id="51" w:name="_Toc234762595"/>
       <w:r>
         <w:t>7.3 SQL Injection and XSS Prevention</w:t>
       </w:r>
@@ -14026,7 +14026,7 @@
       <w:pPr>
         <w:pStyle w:val="Heading1"/>
       </w:pPr>
-      <w:bookmarkStart w:id="52" w:name="_Toc234762122"/>
+      <w:bookmarkStart w:id="52" w:name="_Toc234762596"/>
       <w:r>
         <w:t>7.4 Transaction and Stock Integrity</w:t>
       </w:r>
@@ -14079,7 +14079,7 @@
       <w:pPr>
         <w:pStyle w:val="Heading1"/>
       </w:pPr>
-      <w:bookmarkStart w:id="53" w:name="_Toc234762123"/>
+      <w:bookmarkStart w:id="53" w:name="_Toc234762597"/>
       <w:r>
         <w:t>7.5 Upload and Validation Controls</w:t>
       </w:r>
@@ -14402,7 +14402,7 @@
       <w:pPr>
         <w:pStyle w:val="Heading1"/>
       </w:pPr>
-      <w:bookmarkStart w:id="54" w:name="_Toc234762124"/>
+      <w:bookmarkStart w:id="54" w:name="_Toc234762598"/>
       <w:r>
         <w:t>8.1 Testing Strategy</w:t>
       </w:r>
@@ -14441,7 +14441,7 @@
           <w:noProof/>
         </w:rPr>
         <w:drawing>
-          <wp:inline distT="0" distB="0" distL="0" distR="0" wp14:anchorId="76DC4E70" wp14:editId="7CBA1E83">
+          <wp:inline distT="0" distB="0" distL="0" distR="0" wp14:anchorId="0A6073FD" wp14:editId="314E76BF">
             <wp:extent cx="6126480" cy="3460047"/>
             <wp:effectExtent l="0" t="0" r="0" b="0"/>
             <wp:docPr id="14" name="Picture 14"/>
@@ -14520,7 +14520,7 @@
       <w:pPr>
         <w:pStyle w:val="Heading1"/>
       </w:pPr>
-      <w:bookmarkStart w:id="55" w:name="_Toc234762125"/>
+      <w:bookmarkStart w:id="55" w:name="_Toc234762599"/>
       <w:r>
         <w:t>8.2 Authentication Tests</w:t>
       </w:r>
@@ -14573,7 +14573,7 @@
       <w:pPr>
         <w:pStyle w:val="Heading1"/>
       </w:pPr>
-      <w:bookmarkStart w:id="56" w:name="_Toc234762126"/>
+      <w:bookmarkStart w:id="56" w:name="_Toc234762600"/>
       <w:r>
         <w:t>8.3 Cart and Checkout Tests</w:t>
       </w:r>
@@ -14626,7 +14626,7 @@
       <w:pPr>
         <w:pStyle w:val="Heading1"/>
       </w:pPr>
-      <w:bookmarkStart w:id="57" w:name="_Toc234762127"/>
+      <w:bookmarkStart w:id="57" w:name="_Toc234762601"/>
       <w:r>
         <w:t>8.4 Multi-Role Lifecycle Test</w:t>
       </w:r>
@@ -14679,7 +14679,7 @@
       <w:pPr>
         <w:pStyle w:val="Heading1"/>
       </w:pPr>
-      <w:bookmarkStart w:id="58" w:name="_Toc234762128"/>
+      <w:bookmarkStart w:id="58" w:name="_Toc234762602"/>
       <w:r>
         <w:t>8.5 CRUD and Upload Tests</w:t>
       </w:r>
@@ -14732,7 +14732,7 @@
       <w:pPr>
         <w:pStyle w:val="Heading1"/>
       </w:pPr>
-      <w:bookmarkStart w:id="59" w:name="_Toc234762129"/>
+      <w:bookmarkStart w:id="59" w:name="_Toc234762603"/>
       <w:r>
         <w:t>8.6 Review, Settings and Export Tests</w:t>
       </w:r>
@@ -14785,7 +14785,7 @@
       <w:pPr>
         <w:pStyle w:val="Heading1"/>
       </w:pPr>
-      <w:bookmarkStart w:id="60" w:name="_Toc234762130"/>
+      <w:bookmarkStart w:id="60" w:name="_Toc234762604"/>
       <w:r>
         <w:t>8.7 Responsive and Usability Review</w:t>
       </w:r>
@@ -14838,7 +14838,7 @@
       <w:pPr>
         <w:pStyle w:val="Heading1"/>
       </w:pPr>
-      <w:bookmarkStart w:id="61" w:name="_Toc234762131"/>
+      <w:bookmarkStart w:id="61" w:name="_Toc234762605"/>
       <w:r>
         <w:t>8.8 Test Result Summary</w:t>
       </w:r>
@@ -14891,7 +14891,7 @@
       <w:pPr>
         <w:pStyle w:val="Heading1"/>
       </w:pPr>
-      <w:bookmarkStart w:id="62" w:name="_Toc234762132"/>
+      <w:bookmarkStart w:id="62" w:name="_Toc234762606"/>
       <w:r>
         <w:t>9.1 Deployment Architecture</w:t>
       </w:r>
@@ -14930,7 +14930,7 @@
           <w:noProof/>
         </w:rPr>
         <w:drawing>
-          <wp:inline distT="0" distB="0" distL="0" distR="0" wp14:anchorId="0B31834D" wp14:editId="0586D042">
+          <wp:inline distT="0" distB="0" distL="0" distR="0" wp14:anchorId="2A2E3BF4" wp14:editId="4ABECCD1">
             <wp:extent cx="6126480" cy="3460047"/>
             <wp:effectExtent l="0" t="0" r="0" b="0"/>
             <wp:docPr id="15" name="Picture 15"/>
@@ -15009,7 +15009,7 @@
       <w:pPr>
         <w:pStyle w:val="Heading1"/>
       </w:pPr>
-      <w:bookmarkStart w:id="63" w:name="_Toc234762133"/>
+      <w:bookmarkStart w:id="63" w:name="_Toc234762607"/>
       <w:r>
         <w:t>9.2 Installation Procedure</w:t>
       </w:r>
@@ -15062,7 +15062,7 @@
       <w:pPr>
         <w:pStyle w:val="Heading1"/>
       </w:pPr>
-      <w:bookmarkStart w:id="64" w:name="_Toc234762134"/>
+      <w:bookmarkStart w:id="64" w:name="_Toc234762608"/>
       <w:r>
         <w:t>9.3 Customer User Manual</w:t>
       </w:r>
@@ -15115,7 +15115,7 @@
       <w:pPr>
         <w:pStyle w:val="Heading1"/>
       </w:pPr>
-      <w:bookmarkStart w:id="65" w:name="_Toc234762135"/>
+      <w:bookmarkStart w:id="65" w:name="_Toc234762609"/>
       <w:r>
         <w:t>9.4 Administrator User Manual</w:t>
       </w:r>
@@ -15168,7 +15168,7 @@
       <w:pPr>
         <w:pStyle w:val="Heading1"/>
       </w:pPr>
-      <w:bookmarkStart w:id="66" w:name="_Toc234762136"/>
+      <w:bookmarkStart w:id="66" w:name="_Toc234762610"/>
       <w:r>
         <w:t>9.5 Kitchen and Delivery Manuals</w:t>
       </w:r>
@@ -15221,7 +15221,7 @@
       <w:pPr>
         <w:pStyle w:val="Heading1"/>
       </w:pPr>
-      <w:bookmarkStart w:id="67" w:name="_Toc234762137"/>
+      <w:bookmarkStart w:id="67" w:name="_Toc234762611"/>
       <w:r>
         <w:t>9.6 Backup and Maintenance</w:t>
       </w:r>
@@ -15274,7 +15274,7 @@
       <w:pPr>
         <w:pStyle w:val="Heading1"/>
       </w:pPr>
-      <w:bookmarkStart w:id="68" w:name="_Toc234762138"/>
+      <w:bookmarkStart w:id="68" w:name="_Toc234762612"/>
       <w:r>
         <w:t>10.1 Results and Achievements</w:t>
       </w:r>
@@ -15293,7 +15293,7 @@
         <w:jc w:val="both"/>
       </w:pPr>
       <w:r>
-        <w:t>In practical operation, the final system integrates attractive public, customer and staff experiences with functional server-side behavior. In this project, fifteen database tables and multiple roles support the full order lifecycle. Requests are checked at the server boundary, data is exchanged through prepared PDO statements, and the resulting state is rendered back into a responsive interface.</w:t>
+        <w:t>In practical operation, the final system integrates attractive public, customer and staff experiences with functional server-side behavior. In this project, thirteen database tables and multiple roles support the full order lifecycle. Requests are checked at the server boundary, data is exchanged through prepared PDO statements, and the resulting state is rendered back into a responsive interface.</w:t>
       </w:r>
     </w:p>
     <w:p>
@@ -15327,7 +15327,7 @@
       <w:pPr>
         <w:pStyle w:val="Heading1"/>
       </w:pPr>
-      <w:bookmarkStart w:id="69" w:name="_Toc234762139"/>
+      <w:bookmarkStart w:id="69" w:name="_Toc234762613"/>
       <w:r>
         <w:t>10.2 Current Limitations</w:t>
       </w:r>
@@ -15380,7 +15380,7 @@
       <w:pPr>
         <w:pStyle w:val="Heading1"/>
       </w:pPr>
-      <w:bookmarkStart w:id="70" w:name="_Toc234762140"/>
+      <w:bookmarkStart w:id="70" w:name="_Toc234762614"/>
       <w:r>
         <w:t>10.3 Future Enhancements</w:t>
       </w:r>
@@ -15433,7 +15433,7 @@
       <w:pPr>
         <w:pStyle w:val="Heading1"/>
       </w:pPr>
-      <w:bookmarkStart w:id="71" w:name="_Toc234762141"/>
+      <w:bookmarkStart w:id="71" w:name="_Toc234762615"/>
       <w:r>
         <w:t>10.4 Conclusion</w:t>
       </w:r>
@@ -15486,7 +15486,7 @@
       <w:pPr>
         <w:pStyle w:val="Heading1"/>
       </w:pPr>
-      <w:bookmarkStart w:id="72" w:name="_Toc234762142"/>
+      <w:bookmarkStart w:id="72" w:name="_Toc234762616"/>
       <w:r>
         <w:t>Detailed Functional Test Cases</w:t>
       </w:r>
@@ -16861,7 +16861,7 @@
       <w:pPr>
         <w:pStyle w:val="Heading1"/>
       </w:pPr>
-      <w:bookmarkStart w:id="73" w:name="_Toc234762143"/>
+      <w:bookmarkStart w:id="73" w:name="_Toc234762617"/>
       <w:r>
         <w:t>Boundary and Negative Test Cases</w:t>
       </w:r>
@@ -17786,7 +17786,7 @@
       <w:pPr>
         <w:pStyle w:val="Heading1"/>
       </w:pPr>
-      <w:bookmarkStart w:id="74" w:name="_Toc234762144"/>
+      <w:bookmarkStart w:id="74" w:name="_Toc234762618"/>
       <w:r>
         <w:t>Project Risk Register</w:t>
       </w:r>
@@ -18443,7 +18443,7 @@
       <w:pPr>
         <w:pStyle w:val="Heading1"/>
       </w:pPr>
-      <w:bookmarkStart w:id="75" w:name="_Toc234762145"/>
+      <w:bookmarkStart w:id="75" w:name="_Toc234762619"/>
       <w:r>
         <w:t>Bibliography</w:t>
       </w:r>
@@ -18568,7 +18568,7 @@
       <w:pPr>
         <w:pStyle w:val="Heading1"/>
       </w:pPr>
-      <w:bookmarkStart w:id="76" w:name="_Toc234762146"/>
+      <w:bookmarkStart w:id="76" w:name="_Toc234762620"/>
       <w:r>
         <w:t>Appendix A: Database Table Dictionary</w:t>
       </w:r>
@@ -19493,7 +19493,7 @@
       <w:pPr>
         <w:pStyle w:val="Heading1"/>
       </w:pPr>
-      <w:bookmarkStart w:id="77" w:name="_Toc234762147"/>
+      <w:bookmarkStart w:id="77" w:name="_Toc234762621"/>
       <w:r>
         <w:t>Appendix B: Representative Action Catalogue</w:t>
       </w:r>
@@ -20213,7 +20213,7 @@
       <w:pPr>
         <w:pStyle w:val="Heading1"/>
       </w:pPr>
-      <w:bookmarkStart w:id="78" w:name="_Toc234762148"/>
+      <w:bookmarkStart w:id="78" w:name="_Toc234762622"/>
       <w:r>
         <w:t>Appendix C: Installation Checklist</w:t>
       </w:r>
@@ -20306,7 +20306,7 @@
       <w:pPr>
         <w:pStyle w:val="Heading1"/>
       </w:pPr>
-      <w:bookmarkStart w:id="79" w:name="_Toc234762149"/>
+      <w:bookmarkStart w:id="79" w:name="_Toc234762623"/>
       <w:r>
         <w:t>Appendix D: Diagram Arrow Validation</w:t>
       </w:r>
@@ -21438,7 +21438,7 @@
       <w:pPr>
         <w:pStyle w:val="Heading1"/>
       </w:pPr>
-      <w:bookmarkStart w:id="80" w:name="_Toc234762150"/>
+      <w:bookmarkStart w:id="80" w:name="_Toc234762624"/>
       <w:r>
         <w:t>Appendix E: Submission Customization Checklist</w:t>
       </w:r>
@@ -21517,7 +21517,7 @@
       <w:pPr>
         <w:pStyle w:val="Heading1"/>
       </w:pPr>
-      <w:bookmarkStart w:id="81" w:name="_Toc234762151"/>
+      <w:bookmarkStart w:id="81" w:name="_Toc234762625"/>
       <w:r>
         <w:lastRenderedPageBreak/>
         <w:t>End of Report</w:t>
@@ -21830,31 +21830,31 @@
       </w:rPr>
     </w:lvl>
   </w:abstractNum>
-  <w:num w:numId="1" w16cid:durableId="675962385">
+  <w:num w:numId="1" w16cid:durableId="1991713820">
     <w:abstractNumId w:val="8"/>
   </w:num>
-  <w:num w:numId="2" w16cid:durableId="1049452771">
+  <w:num w:numId="2" w16cid:durableId="251551888">
     <w:abstractNumId w:val="6"/>
   </w:num>
-  <w:num w:numId="3" w16cid:durableId="450822723">
+  <w:num w:numId="3" w16cid:durableId="1261063081">
     <w:abstractNumId w:val="5"/>
   </w:num>
-  <w:num w:numId="4" w16cid:durableId="156770744">
+  <w:num w:numId="4" w16cid:durableId="1208369862">
     <w:abstractNumId w:val="4"/>
   </w:num>
-  <w:num w:numId="5" w16cid:durableId="456068291">
+  <w:num w:numId="5" w16cid:durableId="527185653">
     <w:abstractNumId w:val="7"/>
   </w:num>
-  <w:num w:numId="6" w16cid:durableId="1969512339">
+  <w:num w:numId="6" w16cid:durableId="567497193">
     <w:abstractNumId w:val="3"/>
   </w:num>
-  <w:num w:numId="7" w16cid:durableId="1589343644">
+  <w:num w:numId="7" w16cid:durableId="528643987">
     <w:abstractNumId w:val="2"/>
   </w:num>
-  <w:num w:numId="8" w16cid:durableId="1628008948">
+  <w:num w:numId="8" w16cid:durableId="956571417">
     <w:abstractNumId w:val="1"/>
   </w:num>
-  <w:num w:numId="9" w16cid:durableId="1539703363">
+  <w:num w:numId="9" w16cid:durableId="388387092">
     <w:abstractNumId w:val="0"/>
   </w:num>
 </w:numbering>
@@ -33246,7 +33246,7 @@
     <w:autoRedefine/>
     <w:uiPriority w:val="39"/>
     <w:unhideWhenUsed/>
-    <w:rsid w:val="00316BFF"/>
+    <w:rsid w:val="002F263B"/>
     <w:pPr>
       <w:spacing w:after="100"/>
     </w:pPr>
@@ -33256,7 +33256,7 @@
     <w:basedOn w:val="DefaultParagraphFont"/>
     <w:uiPriority w:val="99"/>
     <w:unhideWhenUsed/>
-    <w:rsid w:val="00316BFF"/>
+    <w:rsid w:val="002F263B"/>
     <w:rPr>
       <w:color w:val="0000FF" w:themeColor="hyperlink"/>
       <w:u w:val="single"/>

</xml_diff>